<commit_message>
refine readme and agent.md
</commit_message>
<xml_diff>
--- a/report_templates/production_template.docx
+++ b/report_templates/production_template.docx
@@ -1199,17 +1199,7 @@
                 <w:szCs w:val="22"/>
                 <w:lang w:eastAsia="zh-CN"/>
               </w:rPr>
-              <w:t>{{light</w:t>
-            </w:r>
-            <w:r>
-              <w:rPr>
-                <w:rFonts w:ascii="Calibri" w:hAnsi="Calibri" w:hint="eastAsia"/>
-                <w:color w:val="000000"/>
-                <w:sz w:val="22"/>
-                <w:szCs w:val="22"/>
-                <w:lang w:eastAsia="zh-CN"/>
-              </w:rPr>
-              <w:t>_source_type}}</w:t>
+              <w:t>{{light_source_type}}</w:t>
             </w:r>
           </w:p>
         </w:tc>
@@ -1410,27 +1400,7 @@
                 <w:szCs w:val="22"/>
                 <w:lang w:eastAsia="zh-CN"/>
               </w:rPr>
-              <w:t>{{</w:t>
-            </w:r>
-            <w:r>
-              <w:rPr>
-                <w:rFonts w:asciiTheme="minorHAnsi" w:eastAsiaTheme="minorEastAsia" w:hAnsiTheme="minorHAnsi" w:cstheme="minorHAnsi" w:hint="eastAsia"/>
-                <w:spacing w:val="-5"/>
-                <w:sz w:val="22"/>
-                <w:szCs w:val="22"/>
-                <w:lang w:eastAsia="zh-CN"/>
-              </w:rPr>
-              <w:t>efficacy</w:t>
-            </w:r>
-            <w:r>
-              <w:rPr>
-                <w:rFonts w:asciiTheme="minorHAnsi" w:eastAsiaTheme="minorEastAsia" w:hAnsiTheme="minorHAnsi" w:cstheme="minorHAnsi" w:hint="eastAsia"/>
-                <w:spacing w:val="-5"/>
-                <w:sz w:val="22"/>
-                <w:szCs w:val="22"/>
-                <w:lang w:eastAsia="zh-CN"/>
-              </w:rPr>
-              <w:t>}}</w:t>
+              <w:t>{{efficacy}}</w:t>
             </w:r>
           </w:p>
         </w:tc>
@@ -1768,27 +1738,7 @@
                 <w:szCs w:val="22"/>
                 <w:lang w:eastAsia="zh-CN"/>
               </w:rPr>
-              <w:t>{{</w:t>
-            </w:r>
-            <w:r>
-              <w:rPr>
-                <w:rFonts w:asciiTheme="minorHAnsi" w:eastAsiaTheme="minorEastAsia" w:hAnsiTheme="minorHAnsi" w:cstheme="minorHAnsi" w:hint="eastAsia"/>
-                <w:spacing w:val="-5"/>
-                <w:sz w:val="22"/>
-                <w:szCs w:val="22"/>
-                <w:lang w:eastAsia="zh-CN"/>
-              </w:rPr>
-              <w:t>sample_receive_date</w:t>
-            </w:r>
-            <w:r>
-              <w:rPr>
-                <w:rFonts w:asciiTheme="minorHAnsi" w:eastAsiaTheme="minorEastAsia" w:hAnsiTheme="minorHAnsi" w:cstheme="minorHAnsi" w:hint="eastAsia"/>
-                <w:spacing w:val="-5"/>
-                <w:sz w:val="22"/>
-                <w:szCs w:val="22"/>
-                <w:lang w:eastAsia="zh-CN"/>
-              </w:rPr>
-              <w:t>}}</w:t>
+              <w:t>{{sample_received_date}}</w:t>
             </w:r>
           </w:p>
         </w:tc>
@@ -1943,29 +1893,7 @@
           <w:szCs w:val="22"/>
           <w:lang w:val="en-GB" w:eastAsia="zh-CN"/>
         </w:rPr>
-        <w:t>{{</w:t>
-      </w:r>
-      <w:r>
-        <w:rPr>
-          <w:rFonts w:ascii="Calibri" w:hAnsi="Calibri" w:cs="Calibri" w:hint="eastAsia"/>
-          <w:b/>
-          <w:bCs/>
-          <w:sz w:val="22"/>
-          <w:szCs w:val="22"/>
-          <w:lang w:val="en-GB" w:eastAsia="zh-CN"/>
-        </w:rPr>
-        <w:t>tbd_remarks</w:t>
-      </w:r>
-      <w:r>
-        <w:rPr>
-          <w:rFonts w:ascii="Calibri" w:hAnsi="Calibri" w:cs="Calibri" w:hint="eastAsia"/>
-          <w:b/>
-          <w:bCs/>
-          <w:sz w:val="22"/>
-          <w:szCs w:val="22"/>
-          <w:lang w:val="en-GB" w:eastAsia="zh-CN"/>
-        </w:rPr>
-        <w:t>}}</w:t>
+        <w:t>{{tbd_remarks}}</w:t>
       </w:r>
     </w:p>
     <w:p>
@@ -4523,47 +4451,7 @@
                 <w:szCs w:val="22"/>
                 <w:lang w:eastAsia="zh-CN"/>
               </w:rPr>
-              <w:t>{{</w:t>
-            </w:r>
-            <w:r>
-              <w:rPr>
-                <w:rFonts w:asciiTheme="minorHAnsi" w:eastAsiaTheme="minorEastAsia" w:hAnsiTheme="minorHAnsi" w:cstheme="minorHAnsi" w:hint="eastAsia"/>
-                <w:spacing w:val="-5"/>
-                <w:sz w:val="22"/>
-                <w:szCs w:val="22"/>
-                <w:lang w:eastAsia="zh-CN"/>
-              </w:rPr>
-              <w:t>controlgear_</w:t>
-            </w:r>
-            <w:r>
-              <w:rPr>
-                <w:rFonts w:asciiTheme="minorHAnsi" w:eastAsiaTheme="minorEastAsia" w:hAnsiTheme="minorHAnsi" w:cstheme="minorHAnsi" w:hint="eastAsia"/>
-                <w:spacing w:val="-5"/>
-                <w:sz w:val="22"/>
-                <w:szCs w:val="22"/>
-                <w:lang w:eastAsia="zh-CN"/>
-              </w:rPr>
-              <w:t>rat</w:t>
-            </w:r>
-            <w:r>
-              <w:rPr>
-                <w:rFonts w:asciiTheme="minorHAnsi" w:eastAsiaTheme="minorEastAsia" w:hAnsiTheme="minorHAnsi" w:cstheme="minorHAnsi" w:hint="eastAsia"/>
-                <w:spacing w:val="-5"/>
-                <w:sz w:val="22"/>
-                <w:szCs w:val="22"/>
-                <w:lang w:eastAsia="zh-CN"/>
-              </w:rPr>
-              <w:t>ing</w:t>
-            </w:r>
-            <w:r>
-              <w:rPr>
-                <w:rFonts w:asciiTheme="minorHAnsi" w:eastAsiaTheme="minorEastAsia" w:hAnsiTheme="minorHAnsi" w:cstheme="minorHAnsi" w:hint="eastAsia"/>
-                <w:spacing w:val="-5"/>
-                <w:sz w:val="22"/>
-                <w:szCs w:val="22"/>
-                <w:lang w:eastAsia="zh-CN"/>
-              </w:rPr>
-              <w:t>}}</w:t>
+              <w:t>{{controlgear_rating}}</w:t>
             </w:r>
           </w:p>
         </w:tc>
@@ -8776,25 +8664,7 @@
                 <w:szCs w:val="22"/>
                 <w:lang w:eastAsia="zh-CN"/>
               </w:rPr>
-              <w:t>{{</w:t>
-            </w:r>
-            <w:r>
-              <w:rPr>
-                <w:rFonts w:asciiTheme="minorHAnsi" w:eastAsia="等线" w:hAnsiTheme="minorHAnsi" w:cs="Calibri" w:hint="eastAsia"/>
-                <w:sz w:val="22"/>
-                <w:szCs w:val="22"/>
-                <w:lang w:eastAsia="zh-CN"/>
-              </w:rPr>
-              <w:t>v.1.a</w:t>
-            </w:r>
-            <w:r>
-              <w:rPr>
-                <w:rFonts w:asciiTheme="minorHAnsi" w:eastAsia="等线" w:hAnsiTheme="minorHAnsi" w:cs="Calibri" w:hint="eastAsia"/>
-                <w:sz w:val="22"/>
-                <w:szCs w:val="22"/>
-                <w:lang w:eastAsia="zh-CN"/>
-              </w:rPr>
-              <w:t>}}</w:t>
+              <w:t>{{v.1.a}}</w:t>
             </w:r>
           </w:p>
         </w:tc>
@@ -10269,8 +10139,8 @@
       </w:tblPr>
       <w:tblGrid>
         <w:gridCol w:w="997"/>
-        <w:gridCol w:w="4799"/>
-        <w:gridCol w:w="2229"/>
+        <w:gridCol w:w="4800"/>
+        <w:gridCol w:w="2228"/>
         <w:gridCol w:w="1237"/>
       </w:tblGrid>
       <w:tr>
@@ -10279,7 +10149,7 @@
         </w:trPr>
         <w:tc>
           <w:tcPr>
-            <w:tcW w:w="579" w:type="pct"/>
+            <w:tcW w:w="538" w:type="pct"/>
             <w:tcBorders>
               <w:top w:val="single" w:sz="6" w:space="0" w:color="auto"/>
               <w:left w:val="single" w:sz="6" w:space="0" w:color="auto"/>
@@ -10313,7 +10183,7 @@
         </w:tc>
         <w:tc>
           <w:tcPr>
-            <w:tcW w:w="2631" w:type="pct"/>
+            <w:tcW w:w="2591" w:type="pct"/>
             <w:tcBorders>
               <w:top w:val="single" w:sz="6" w:space="0" w:color="auto"/>
               <w:left w:val="single" w:sz="6" w:space="0" w:color="auto"/>
@@ -10356,7 +10226,7 @@
         </w:tc>
         <w:tc>
           <w:tcPr>
-            <w:tcW w:w="1244" w:type="pct"/>
+            <w:tcW w:w="1203" w:type="pct"/>
             <w:tcBorders>
               <w:top w:val="single" w:sz="6" w:space="0" w:color="auto"/>
               <w:left w:val="single" w:sz="6" w:space="0" w:color="auto"/>
@@ -10390,7 +10260,7 @@
         </w:tc>
         <w:tc>
           <w:tcPr>
-            <w:tcW w:w="546" w:type="pct"/>
+            <w:tcW w:w="668" w:type="pct"/>
             <w:tcBorders>
               <w:top w:val="single" w:sz="6" w:space="0" w:color="auto"/>
               <w:left w:val="single" w:sz="6" w:space="0" w:color="auto"/>
@@ -10430,7 +10300,7 @@
         </w:trPr>
         <w:tc>
           <w:tcPr>
-            <w:tcW w:w="579" w:type="pct"/>
+            <w:tcW w:w="538" w:type="pct"/>
             <w:tcBorders>
               <w:top w:val="single" w:sz="6" w:space="0" w:color="auto"/>
               <w:left w:val="single" w:sz="6" w:space="0" w:color="auto"/>
@@ -10463,7 +10333,7 @@
         </w:tc>
         <w:tc>
           <w:tcPr>
-            <w:tcW w:w="3875" w:type="pct"/>
+            <w:tcW w:w="3794" w:type="pct"/>
             <w:gridSpan w:val="2"/>
             <w:tcBorders>
               <w:top w:val="single" w:sz="6" w:space="0" w:color="auto"/>
@@ -10499,7 +10369,7 @@
         </w:tc>
         <w:tc>
           <w:tcPr>
-            <w:tcW w:w="546" w:type="pct"/>
+            <w:tcW w:w="668" w:type="pct"/>
             <w:tcBorders>
               <w:top w:val="single" w:sz="6" w:space="0" w:color="auto"/>
               <w:left w:val="single" w:sz="6" w:space="0" w:color="auto"/>
@@ -10530,27 +10400,7 @@
                 <w:szCs w:val="22"/>
                 <w:lang w:eastAsia="zh-CN"/>
               </w:rPr>
-              <w:t>{{v</w:t>
-            </w:r>
-            <w:r>
-              <w:rPr>
-                <w:rFonts w:asciiTheme="minorHAnsi" w:eastAsia="等线" w:hAnsiTheme="minorHAnsi" w:cs="Calibri" w:hint="eastAsia"/>
-                <w:spacing w:val="-2"/>
-                <w:sz w:val="22"/>
-                <w:szCs w:val="22"/>
-                <w:lang w:eastAsia="zh-CN"/>
-              </w:rPr>
-              <w:t>.II</w:t>
-            </w:r>
-            <w:r>
-              <w:rPr>
-                <w:rFonts w:asciiTheme="minorHAnsi" w:eastAsia="等线" w:hAnsiTheme="minorHAnsi" w:cs="Calibri" w:hint="eastAsia"/>
-                <w:spacing w:val="-2"/>
-                <w:sz w:val="22"/>
-                <w:szCs w:val="22"/>
-                <w:lang w:eastAsia="zh-CN"/>
-              </w:rPr>
-              <w:t>.1.a.1}}</w:t>
+              <w:t>{{v.II.1.a}}</w:t>
             </w:r>
           </w:p>
         </w:tc>
@@ -10562,7 +10412,7 @@
         </w:trPr>
         <w:tc>
           <w:tcPr>
-            <w:tcW w:w="579" w:type="pct"/>
+            <w:tcW w:w="538" w:type="pct"/>
             <w:tcBorders>
               <w:top w:val="single" w:sz="6" w:space="0" w:color="auto"/>
               <w:left w:val="single" w:sz="6" w:space="0" w:color="auto"/>
@@ -10586,7 +10436,7 @@
         </w:tc>
         <w:tc>
           <w:tcPr>
-            <w:tcW w:w="2631" w:type="pct"/>
+            <w:tcW w:w="2591" w:type="pct"/>
             <w:tcBorders>
               <w:top w:val="single" w:sz="6" w:space="0" w:color="auto"/>
               <w:left w:val="single" w:sz="6" w:space="0" w:color="auto"/>
@@ -10639,7 +10489,7 @@
         </w:tc>
         <w:tc>
           <w:tcPr>
-            <w:tcW w:w="1244" w:type="pct"/>
+            <w:tcW w:w="1203" w:type="pct"/>
             <w:tcBorders>
               <w:top w:val="single" w:sz="6" w:space="0" w:color="auto"/>
               <w:left w:val="single" w:sz="6" w:space="0" w:color="auto"/>
@@ -10671,7 +10521,7 @@
         </w:tc>
         <w:tc>
           <w:tcPr>
-            <w:tcW w:w="546" w:type="pct"/>
+            <w:tcW w:w="668" w:type="pct"/>
             <w:tcBorders>
               <w:top w:val="single" w:sz="6" w:space="0" w:color="auto"/>
               <w:left w:val="single" w:sz="6" w:space="0" w:color="auto"/>
@@ -10702,37 +10552,7 @@
                 <w:szCs w:val="22"/>
                 <w:lang w:eastAsia="zh-CN"/>
               </w:rPr>
-              <w:t>{{</w:t>
-            </w:r>
-            <w:r>
-              <w:rPr>
-                <w:rFonts w:asciiTheme="minorHAnsi" w:eastAsia="等线" w:hAnsiTheme="minorHAnsi" w:cs="Calibri" w:hint="eastAsia"/>
-                <w:spacing w:val="-2"/>
-                <w:sz w:val="22"/>
-                <w:szCs w:val="22"/>
-                <w:lang w:eastAsia="zh-CN"/>
-              </w:rPr>
-              <w:t>v</w:t>
-            </w:r>
-            <w:r>
-              <w:rPr>
-                <w:rFonts w:asciiTheme="minorHAnsi" w:eastAsia="等线" w:hAnsiTheme="minorHAnsi" w:cs="Calibri" w:hint="eastAsia"/>
-                <w:spacing w:val="-2"/>
-                <w:sz w:val="22"/>
-                <w:szCs w:val="22"/>
-                <w:lang w:eastAsia="zh-CN"/>
-              </w:rPr>
-              <w:t>.II</w:t>
-            </w:r>
-            <w:r>
-              <w:rPr>
-                <w:rFonts w:asciiTheme="minorHAnsi" w:eastAsia="等线" w:hAnsiTheme="minorHAnsi" w:cs="Calibri" w:hint="eastAsia"/>
-                <w:spacing w:val="-2"/>
-                <w:sz w:val="22"/>
-                <w:szCs w:val="22"/>
-                <w:lang w:eastAsia="zh-CN"/>
-              </w:rPr>
-              <w:t>.1.a.2}}</w:t>
+              <w:t>{{v.II.1.a.1}}</w:t>
             </w:r>
           </w:p>
         </w:tc>
@@ -10744,7 +10564,7 @@
         </w:trPr>
         <w:tc>
           <w:tcPr>
-            <w:tcW w:w="579" w:type="pct"/>
+            <w:tcW w:w="538" w:type="pct"/>
             <w:tcBorders>
               <w:top w:val="single" w:sz="6" w:space="0" w:color="auto"/>
               <w:left w:val="single" w:sz="6" w:space="0" w:color="auto"/>
@@ -10768,7 +10588,7 @@
         </w:tc>
         <w:tc>
           <w:tcPr>
-            <w:tcW w:w="2631" w:type="pct"/>
+            <w:tcW w:w="2591" w:type="pct"/>
             <w:tcBorders>
               <w:top w:val="single" w:sz="6" w:space="0" w:color="auto"/>
               <w:left w:val="single" w:sz="6" w:space="0" w:color="auto"/>
@@ -10918,7 +10738,7 @@
         </w:tc>
         <w:tc>
           <w:tcPr>
-            <w:tcW w:w="1244" w:type="pct"/>
+            <w:tcW w:w="1203" w:type="pct"/>
             <w:tcBorders>
               <w:top w:val="single" w:sz="6" w:space="0" w:color="auto"/>
               <w:left w:val="single" w:sz="6" w:space="0" w:color="auto"/>
@@ -10944,13 +10764,13 @@
                 <w:szCs w:val="22"/>
                 <w:lang w:eastAsia="zh-CN"/>
               </w:rPr>
-              <w:t>{{PonMax}}</w:t>
-            </w:r>
-          </w:p>
-        </w:tc>
-        <w:tc>
-          <w:tcPr>
-            <w:tcW w:w="546" w:type="pct"/>
+              <w:t>{{Ponmax}}</w:t>
+            </w:r>
+          </w:p>
+        </w:tc>
+        <w:tc>
+          <w:tcPr>
+            <w:tcW w:w="668" w:type="pct"/>
             <w:tcBorders>
               <w:top w:val="single" w:sz="6" w:space="0" w:color="auto"/>
               <w:left w:val="single" w:sz="6" w:space="0" w:color="auto"/>
@@ -10981,27 +10801,7 @@
                 <w:szCs w:val="22"/>
                 <w:lang w:eastAsia="zh-CN"/>
               </w:rPr>
-              <w:t>{{v</w:t>
-            </w:r>
-            <w:r>
-              <w:rPr>
-                <w:rFonts w:asciiTheme="minorHAnsi" w:eastAsia="等线" w:hAnsiTheme="minorHAnsi" w:cs="Calibri" w:hint="eastAsia"/>
-                <w:spacing w:val="-2"/>
-                <w:sz w:val="22"/>
-                <w:szCs w:val="22"/>
-                <w:lang w:eastAsia="zh-CN"/>
-              </w:rPr>
-              <w:t>.II</w:t>
-            </w:r>
-            <w:r>
-              <w:rPr>
-                <w:rFonts w:asciiTheme="minorHAnsi" w:eastAsia="等线" w:hAnsiTheme="minorHAnsi" w:cs="Calibri" w:hint="eastAsia"/>
-                <w:spacing w:val="-2"/>
-                <w:sz w:val="22"/>
-                <w:szCs w:val="22"/>
-                <w:lang w:eastAsia="zh-CN"/>
-              </w:rPr>
-              <w:t>.1.a.3}}</w:t>
+              <w:t>{{v.II.1.a.2}}</w:t>
             </w:r>
           </w:p>
         </w:tc>
@@ -11013,7 +10813,7 @@
         </w:trPr>
         <w:tc>
           <w:tcPr>
-            <w:tcW w:w="579" w:type="pct"/>
+            <w:tcW w:w="538" w:type="pct"/>
             <w:tcBorders>
               <w:top w:val="single" w:sz="6" w:space="0" w:color="auto"/>
               <w:left w:val="single" w:sz="6" w:space="0" w:color="auto"/>
@@ -11040,7 +10840,7 @@
         </w:tc>
         <w:tc>
           <w:tcPr>
-            <w:tcW w:w="2631" w:type="pct"/>
+            <w:tcW w:w="2591" w:type="pct"/>
             <w:tcBorders>
               <w:top w:val="single" w:sz="6" w:space="0" w:color="auto"/>
               <w:left w:val="single" w:sz="6" w:space="0" w:color="auto"/>
@@ -11107,7 +10907,7 @@
         </w:tc>
         <w:tc>
           <w:tcPr>
-            <w:tcW w:w="1244" w:type="pct"/>
+            <w:tcW w:w="1203" w:type="pct"/>
             <w:tcBorders>
               <w:top w:val="single" w:sz="6" w:space="0" w:color="auto"/>
               <w:left w:val="single" w:sz="6" w:space="0" w:color="auto"/>
@@ -11133,7 +10933,7 @@
         </w:tc>
         <w:tc>
           <w:tcPr>
-            <w:tcW w:w="546" w:type="pct"/>
+            <w:tcW w:w="668" w:type="pct"/>
             <w:tcBorders>
               <w:top w:val="single" w:sz="6" w:space="0" w:color="auto"/>
               <w:left w:val="single" w:sz="6" w:space="0" w:color="auto"/>
@@ -11150,8 +10950,6 @@
               <w:jc w:val="center"/>
               <w:rPr>
                 <w:rFonts w:asciiTheme="minorHAnsi" w:eastAsia="等线" w:hAnsiTheme="minorHAnsi" w:cs="Calibri"/>
-                <w:i/>
-                <w:iCs/>
                 <w:spacing w:val="-2"/>
                 <w:sz w:val="22"/>
                 <w:szCs w:val="22"/>
@@ -11166,27 +10964,7 @@
                 <w:szCs w:val="22"/>
                 <w:lang w:eastAsia="zh-CN"/>
               </w:rPr>
-              <w:t>{{v</w:t>
-            </w:r>
-            <w:r>
-              <w:rPr>
-                <w:rFonts w:asciiTheme="minorHAnsi" w:eastAsia="等线" w:hAnsiTheme="minorHAnsi" w:cs="Calibri" w:hint="eastAsia"/>
-                <w:spacing w:val="-2"/>
-                <w:sz w:val="22"/>
-                <w:szCs w:val="22"/>
-                <w:lang w:eastAsia="zh-CN"/>
-              </w:rPr>
-              <w:t>.II</w:t>
-            </w:r>
-            <w:r>
-              <w:rPr>
-                <w:rFonts w:asciiTheme="minorHAnsi" w:eastAsia="等线" w:hAnsiTheme="minorHAnsi" w:cs="Calibri" w:hint="eastAsia"/>
-                <w:spacing w:val="-2"/>
-                <w:sz w:val="22"/>
-                <w:szCs w:val="22"/>
-                <w:lang w:eastAsia="zh-CN"/>
-              </w:rPr>
-              <w:t>.1.a.4}}</w:t>
+              <w:t>{{v.II.1.a.3}}</w:t>
             </w:r>
           </w:p>
         </w:tc>
@@ -11198,7 +10976,7 @@
         </w:trPr>
         <w:tc>
           <w:tcPr>
-            <w:tcW w:w="579" w:type="pct"/>
+            <w:tcW w:w="538" w:type="pct"/>
             <w:tcBorders>
               <w:top w:val="single" w:sz="6" w:space="0" w:color="auto"/>
               <w:left w:val="single" w:sz="6" w:space="0" w:color="auto"/>
@@ -11225,7 +11003,7 @@
         </w:tc>
         <w:tc>
           <w:tcPr>
-            <w:tcW w:w="2631" w:type="pct"/>
+            <w:tcW w:w="2591" w:type="pct"/>
             <w:tcBorders>
               <w:top w:val="single" w:sz="6" w:space="0" w:color="auto"/>
               <w:left w:val="single" w:sz="6" w:space="0" w:color="auto"/>
@@ -11280,7 +11058,7 @@
         </w:tc>
         <w:tc>
           <w:tcPr>
-            <w:tcW w:w="1244" w:type="pct"/>
+            <w:tcW w:w="1203" w:type="pct"/>
             <w:tcBorders>
               <w:top w:val="single" w:sz="6" w:space="0" w:color="auto"/>
               <w:left w:val="single" w:sz="6" w:space="0" w:color="auto"/>
@@ -11306,7 +11084,7 @@
         </w:tc>
         <w:tc>
           <w:tcPr>
-            <w:tcW w:w="546" w:type="pct"/>
+            <w:tcW w:w="668" w:type="pct"/>
             <w:tcBorders>
               <w:top w:val="single" w:sz="6" w:space="0" w:color="auto"/>
               <w:left w:val="single" w:sz="6" w:space="0" w:color="auto"/>
@@ -11339,27 +11117,7 @@
                 <w:szCs w:val="22"/>
                 <w:lang w:eastAsia="zh-CN"/>
               </w:rPr>
-              <w:t>{{v</w:t>
-            </w:r>
-            <w:r>
-              <w:rPr>
-                <w:rFonts w:asciiTheme="minorHAnsi" w:eastAsia="等线" w:hAnsiTheme="minorHAnsi" w:cs="Calibri" w:hint="eastAsia"/>
-                <w:spacing w:val="-2"/>
-                <w:sz w:val="22"/>
-                <w:szCs w:val="22"/>
-                <w:lang w:eastAsia="zh-CN"/>
-              </w:rPr>
-              <w:t>.II</w:t>
-            </w:r>
-            <w:r>
-              <w:rPr>
-                <w:rFonts w:asciiTheme="minorHAnsi" w:eastAsia="等线" w:hAnsiTheme="minorHAnsi" w:cs="Calibri" w:hint="eastAsia"/>
-                <w:spacing w:val="-2"/>
-                <w:sz w:val="22"/>
-                <w:szCs w:val="22"/>
-                <w:lang w:eastAsia="zh-CN"/>
-              </w:rPr>
-              <w:t>.1.a.5}}</w:t>
+              <w:t>{{v.II.1.a.4}}</w:t>
             </w:r>
           </w:p>
         </w:tc>
@@ -11371,7 +11129,7 @@
         </w:trPr>
         <w:tc>
           <w:tcPr>
-            <w:tcW w:w="579" w:type="pct"/>
+            <w:tcW w:w="538" w:type="pct"/>
             <w:tcBorders>
               <w:top w:val="single" w:sz="6" w:space="0" w:color="auto"/>
               <w:left w:val="single" w:sz="6" w:space="0" w:color="auto"/>
@@ -11398,7 +11156,7 @@
         </w:tc>
         <w:tc>
           <w:tcPr>
-            <w:tcW w:w="2631" w:type="pct"/>
+            <w:tcW w:w="2591" w:type="pct"/>
             <w:tcBorders>
               <w:top w:val="single" w:sz="6" w:space="0" w:color="auto"/>
               <w:left w:val="single" w:sz="6" w:space="0" w:color="auto"/>
@@ -11431,7 +11189,7 @@
         </w:tc>
         <w:tc>
           <w:tcPr>
-            <w:tcW w:w="1244" w:type="pct"/>
+            <w:tcW w:w="1203" w:type="pct"/>
             <w:tcBorders>
               <w:top w:val="single" w:sz="6" w:space="0" w:color="auto"/>
               <w:left w:val="single" w:sz="6" w:space="0" w:color="auto"/>
@@ -11457,7 +11215,7 @@
         </w:tc>
         <w:tc>
           <w:tcPr>
-            <w:tcW w:w="546" w:type="pct"/>
+            <w:tcW w:w="668" w:type="pct"/>
             <w:tcBorders>
               <w:top w:val="single" w:sz="6" w:space="0" w:color="auto"/>
               <w:left w:val="single" w:sz="6" w:space="0" w:color="auto"/>
@@ -11488,27 +11246,7 @@
                 <w:szCs w:val="22"/>
                 <w:lang w:eastAsia="zh-CN"/>
               </w:rPr>
-              <w:t>{{v</w:t>
-            </w:r>
-            <w:r>
-              <w:rPr>
-                <w:rFonts w:asciiTheme="minorHAnsi" w:eastAsia="等线" w:hAnsiTheme="minorHAnsi" w:cs="Calibri" w:hint="eastAsia"/>
-                <w:spacing w:val="-2"/>
-                <w:sz w:val="22"/>
-                <w:szCs w:val="22"/>
-                <w:lang w:eastAsia="zh-CN"/>
-              </w:rPr>
-              <w:t>.II</w:t>
-            </w:r>
-            <w:r>
-              <w:rPr>
-                <w:rFonts w:asciiTheme="minorHAnsi" w:eastAsia="等线" w:hAnsiTheme="minorHAnsi" w:cs="Calibri" w:hint="eastAsia"/>
-                <w:spacing w:val="-2"/>
-                <w:sz w:val="22"/>
-                <w:szCs w:val="22"/>
-                <w:lang w:eastAsia="zh-CN"/>
-              </w:rPr>
-              <w:t>.1.a.6}}</w:t>
+              <w:t>{{v.II.1.a.5}}</w:t>
             </w:r>
           </w:p>
         </w:tc>
@@ -11520,7 +11258,7 @@
         </w:trPr>
         <w:tc>
           <w:tcPr>
-            <w:tcW w:w="579" w:type="pct"/>
+            <w:tcW w:w="538" w:type="pct"/>
             <w:tcBorders>
               <w:top w:val="single" w:sz="6" w:space="0" w:color="auto"/>
               <w:left w:val="single" w:sz="6" w:space="0" w:color="auto"/>
@@ -11547,7 +11285,7 @@
         </w:tc>
         <w:tc>
           <w:tcPr>
-            <w:tcW w:w="2631" w:type="pct"/>
+            <w:tcW w:w="2591" w:type="pct"/>
             <w:tcBorders>
               <w:top w:val="single" w:sz="6" w:space="0" w:color="auto"/>
               <w:left w:val="single" w:sz="6" w:space="0" w:color="auto"/>
@@ -11580,7 +11318,7 @@
         </w:tc>
         <w:tc>
           <w:tcPr>
-            <w:tcW w:w="1244" w:type="pct"/>
+            <w:tcW w:w="1203" w:type="pct"/>
             <w:tcBorders>
               <w:top w:val="single" w:sz="6" w:space="0" w:color="auto"/>
               <w:left w:val="single" w:sz="6" w:space="0" w:color="auto"/>
@@ -11606,7 +11344,7 @@
         </w:tc>
         <w:tc>
           <w:tcPr>
-            <w:tcW w:w="546" w:type="pct"/>
+            <w:tcW w:w="668" w:type="pct"/>
             <w:tcBorders>
               <w:top w:val="single" w:sz="6" w:space="0" w:color="auto"/>
               <w:left w:val="single" w:sz="6" w:space="0" w:color="auto"/>
@@ -11637,27 +11375,7 @@
                 <w:szCs w:val="22"/>
                 <w:lang w:eastAsia="zh-CN"/>
               </w:rPr>
-              <w:t>{{v</w:t>
-            </w:r>
-            <w:r>
-              <w:rPr>
-                <w:rFonts w:asciiTheme="minorHAnsi" w:eastAsia="等线" w:hAnsiTheme="minorHAnsi" w:cs="Calibri" w:hint="eastAsia"/>
-                <w:spacing w:val="-2"/>
-                <w:sz w:val="22"/>
-                <w:szCs w:val="22"/>
-                <w:lang w:eastAsia="zh-CN"/>
-              </w:rPr>
-              <w:t>.II</w:t>
-            </w:r>
-            <w:r>
-              <w:rPr>
-                <w:rFonts w:asciiTheme="minorHAnsi" w:eastAsia="等线" w:hAnsiTheme="minorHAnsi" w:cs="Calibri" w:hint="eastAsia"/>
-                <w:spacing w:val="-2"/>
-                <w:sz w:val="22"/>
-                <w:szCs w:val="22"/>
-                <w:lang w:eastAsia="zh-CN"/>
-              </w:rPr>
-              <w:t>.1.a.7}}</w:t>
+              <w:t>{{v.II.1.a.6}}</w:t>
             </w:r>
           </w:p>
         </w:tc>
@@ -11669,7 +11387,7 @@
         </w:trPr>
         <w:tc>
           <w:tcPr>
-            <w:tcW w:w="579" w:type="pct"/>
+            <w:tcW w:w="538" w:type="pct"/>
             <w:tcBorders>
               <w:top w:val="single" w:sz="6" w:space="0" w:color="auto"/>
               <w:left w:val="single" w:sz="6" w:space="0" w:color="auto"/>
@@ -11696,7 +11414,7 @@
         </w:tc>
         <w:tc>
           <w:tcPr>
-            <w:tcW w:w="2631" w:type="pct"/>
+            <w:tcW w:w="2591" w:type="pct"/>
             <w:tcBorders>
               <w:top w:val="single" w:sz="6" w:space="0" w:color="auto"/>
               <w:left w:val="single" w:sz="6" w:space="0" w:color="auto"/>
@@ -11729,7 +11447,7 @@
         </w:tc>
         <w:tc>
           <w:tcPr>
-            <w:tcW w:w="1244" w:type="pct"/>
+            <w:tcW w:w="1203" w:type="pct"/>
             <w:tcBorders>
               <w:top w:val="single" w:sz="6" w:space="0" w:color="auto"/>
               <w:left w:val="single" w:sz="6" w:space="0" w:color="auto"/>
@@ -11755,7 +11473,7 @@
         </w:tc>
         <w:tc>
           <w:tcPr>
-            <w:tcW w:w="546" w:type="pct"/>
+            <w:tcW w:w="668" w:type="pct"/>
             <w:tcBorders>
               <w:top w:val="single" w:sz="6" w:space="0" w:color="auto"/>
               <w:left w:val="single" w:sz="6" w:space="0" w:color="auto"/>
@@ -11786,47 +11504,7 @@
                 <w:szCs w:val="22"/>
                 <w:lang w:eastAsia="zh-CN"/>
               </w:rPr>
-              <w:t>{{v</w:t>
-            </w:r>
-            <w:r>
-              <w:rPr>
-                <w:rFonts w:asciiTheme="minorHAnsi" w:eastAsia="等线" w:hAnsiTheme="minorHAnsi" w:cs="Calibri" w:hint="eastAsia"/>
-                <w:spacing w:val="-2"/>
-                <w:sz w:val="22"/>
-                <w:szCs w:val="22"/>
-                <w:lang w:eastAsia="zh-CN"/>
-              </w:rPr>
-              <w:t>.II</w:t>
-            </w:r>
-            <w:r>
-              <w:rPr>
-                <w:rFonts w:asciiTheme="minorHAnsi" w:eastAsia="等线" w:hAnsiTheme="minorHAnsi" w:cs="Calibri" w:hint="eastAsia"/>
-                <w:spacing w:val="-2"/>
-                <w:sz w:val="22"/>
-                <w:szCs w:val="22"/>
-                <w:lang w:eastAsia="zh-CN"/>
-              </w:rPr>
-              <w:t>.1.a.</w:t>
-            </w:r>
-            <w:r>
-              <w:rPr>
-                <w:rFonts w:asciiTheme="minorHAnsi" w:eastAsia="等线" w:hAnsiTheme="minorHAnsi" w:cs="Calibri" w:hint="eastAsia"/>
-                <w:spacing w:val="-2"/>
-                <w:sz w:val="22"/>
-                <w:szCs w:val="22"/>
-                <w:lang w:eastAsia="zh-CN"/>
-              </w:rPr>
-              <w:t>8</w:t>
-            </w:r>
-            <w:r>
-              <w:rPr>
-                <w:rFonts w:asciiTheme="minorHAnsi" w:eastAsia="等线" w:hAnsiTheme="minorHAnsi" w:cs="Calibri" w:hint="eastAsia"/>
-                <w:spacing w:val="-2"/>
-                <w:sz w:val="22"/>
-                <w:szCs w:val="22"/>
-                <w:lang w:eastAsia="zh-CN"/>
-              </w:rPr>
-              <w:t>}}</w:t>
+              <w:t>{{v.II.1.a.7}}</w:t>
             </w:r>
           </w:p>
         </w:tc>
@@ -11838,7 +11516,7 @@
         </w:trPr>
         <w:tc>
           <w:tcPr>
-            <w:tcW w:w="579" w:type="pct"/>
+            <w:tcW w:w="538" w:type="pct"/>
             <w:tcBorders>
               <w:top w:val="single" w:sz="6" w:space="0" w:color="auto"/>
               <w:left w:val="single" w:sz="6" w:space="0" w:color="auto"/>
@@ -11865,7 +11543,7 @@
         </w:tc>
         <w:tc>
           <w:tcPr>
-            <w:tcW w:w="2631" w:type="pct"/>
+            <w:tcW w:w="2591" w:type="pct"/>
             <w:tcBorders>
               <w:top w:val="single" w:sz="6" w:space="0" w:color="auto"/>
               <w:left w:val="single" w:sz="6" w:space="0" w:color="auto"/>
@@ -11898,7 +11576,7 @@
         </w:tc>
         <w:tc>
           <w:tcPr>
-            <w:tcW w:w="1244" w:type="pct"/>
+            <w:tcW w:w="1203" w:type="pct"/>
             <w:tcBorders>
               <w:top w:val="single" w:sz="6" w:space="0" w:color="auto"/>
               <w:left w:val="single" w:sz="6" w:space="0" w:color="auto"/>
@@ -11924,7 +11602,7 @@
         </w:tc>
         <w:tc>
           <w:tcPr>
-            <w:tcW w:w="546" w:type="pct"/>
+            <w:tcW w:w="668" w:type="pct"/>
             <w:tcBorders>
               <w:top w:val="single" w:sz="6" w:space="0" w:color="auto"/>
               <w:left w:val="single" w:sz="6" w:space="0" w:color="auto"/>
@@ -11955,47 +11633,7 @@
                 <w:szCs w:val="22"/>
                 <w:lang w:eastAsia="zh-CN"/>
               </w:rPr>
-              <w:t>{{v</w:t>
-            </w:r>
-            <w:r>
-              <w:rPr>
-                <w:rFonts w:asciiTheme="minorHAnsi" w:eastAsia="等线" w:hAnsiTheme="minorHAnsi" w:cs="Calibri" w:hint="eastAsia"/>
-                <w:spacing w:val="-2"/>
-                <w:sz w:val="22"/>
-                <w:szCs w:val="22"/>
-                <w:lang w:eastAsia="zh-CN"/>
-              </w:rPr>
-              <w:t>.II</w:t>
-            </w:r>
-            <w:r>
-              <w:rPr>
-                <w:rFonts w:asciiTheme="minorHAnsi" w:eastAsia="等线" w:hAnsiTheme="minorHAnsi" w:cs="Calibri" w:hint="eastAsia"/>
-                <w:spacing w:val="-2"/>
-                <w:sz w:val="22"/>
-                <w:szCs w:val="22"/>
-                <w:lang w:eastAsia="zh-CN"/>
-              </w:rPr>
-              <w:t>.1.a.</w:t>
-            </w:r>
-            <w:r>
-              <w:rPr>
-                <w:rFonts w:asciiTheme="minorHAnsi" w:eastAsia="等线" w:hAnsiTheme="minorHAnsi" w:cs="Calibri" w:hint="eastAsia"/>
-                <w:spacing w:val="-2"/>
-                <w:sz w:val="22"/>
-                <w:szCs w:val="22"/>
-                <w:lang w:eastAsia="zh-CN"/>
-              </w:rPr>
-              <w:t>9</w:t>
-            </w:r>
-            <w:r>
-              <w:rPr>
-                <w:rFonts w:asciiTheme="minorHAnsi" w:eastAsia="等线" w:hAnsiTheme="minorHAnsi" w:cs="Calibri" w:hint="eastAsia"/>
-                <w:spacing w:val="-2"/>
-                <w:sz w:val="22"/>
-                <w:szCs w:val="22"/>
-                <w:lang w:eastAsia="zh-CN"/>
-              </w:rPr>
-              <w:t>}}</w:t>
+              <w:t>{{v.II.1.a.8}}</w:t>
             </w:r>
           </w:p>
         </w:tc>
@@ -12007,7 +11645,7 @@
         </w:trPr>
         <w:tc>
           <w:tcPr>
-            <w:tcW w:w="579" w:type="pct"/>
+            <w:tcW w:w="538" w:type="pct"/>
             <w:tcBorders>
               <w:top w:val="single" w:sz="6" w:space="0" w:color="auto"/>
               <w:left w:val="single" w:sz="6" w:space="0" w:color="auto"/>
@@ -12034,7 +11672,7 @@
         </w:tc>
         <w:tc>
           <w:tcPr>
-            <w:tcW w:w="2631" w:type="pct"/>
+            <w:tcW w:w="2591" w:type="pct"/>
             <w:tcBorders>
               <w:top w:val="single" w:sz="6" w:space="0" w:color="auto"/>
               <w:left w:val="single" w:sz="6" w:space="0" w:color="auto"/>
@@ -12067,7 +11705,7 @@
         </w:tc>
         <w:tc>
           <w:tcPr>
-            <w:tcW w:w="1244" w:type="pct"/>
+            <w:tcW w:w="1203" w:type="pct"/>
             <w:tcBorders>
               <w:top w:val="single" w:sz="6" w:space="0" w:color="auto"/>
               <w:left w:val="single" w:sz="6" w:space="0" w:color="auto"/>
@@ -12091,7 +11729,7 @@
         </w:tc>
         <w:tc>
           <w:tcPr>
-            <w:tcW w:w="546" w:type="pct"/>
+            <w:tcW w:w="668" w:type="pct"/>
             <w:tcBorders>
               <w:top w:val="single" w:sz="6" w:space="0" w:color="auto"/>
               <w:left w:val="single" w:sz="6" w:space="0" w:color="auto"/>
@@ -12122,47 +11760,7 @@
                 <w:szCs w:val="22"/>
                 <w:lang w:eastAsia="zh-CN"/>
               </w:rPr>
-              <w:t>{{v</w:t>
-            </w:r>
-            <w:r>
-              <w:rPr>
-                <w:rFonts w:asciiTheme="minorHAnsi" w:eastAsia="等线" w:hAnsiTheme="minorHAnsi" w:cs="Calibri" w:hint="eastAsia"/>
-                <w:spacing w:val="-2"/>
-                <w:sz w:val="22"/>
-                <w:szCs w:val="22"/>
-                <w:lang w:eastAsia="zh-CN"/>
-              </w:rPr>
-              <w:t>.II</w:t>
-            </w:r>
-            <w:r>
-              <w:rPr>
-                <w:rFonts w:asciiTheme="minorHAnsi" w:eastAsia="等线" w:hAnsiTheme="minorHAnsi" w:cs="Calibri" w:hint="eastAsia"/>
-                <w:spacing w:val="-2"/>
-                <w:sz w:val="22"/>
-                <w:szCs w:val="22"/>
-                <w:lang w:eastAsia="zh-CN"/>
-              </w:rPr>
-              <w:t>.1.a.</w:t>
-            </w:r>
-            <w:r>
-              <w:rPr>
-                <w:rFonts w:asciiTheme="minorHAnsi" w:eastAsia="等线" w:hAnsiTheme="minorHAnsi" w:cs="Calibri" w:hint="eastAsia"/>
-                <w:spacing w:val="-2"/>
-                <w:sz w:val="22"/>
-                <w:szCs w:val="22"/>
-                <w:lang w:eastAsia="zh-CN"/>
-              </w:rPr>
-              <w:t>10</w:t>
-            </w:r>
-            <w:r>
-              <w:rPr>
-                <w:rFonts w:asciiTheme="minorHAnsi" w:eastAsia="等线" w:hAnsiTheme="minorHAnsi" w:cs="Calibri" w:hint="eastAsia"/>
-                <w:spacing w:val="-2"/>
-                <w:sz w:val="22"/>
-                <w:szCs w:val="22"/>
-                <w:lang w:eastAsia="zh-CN"/>
-              </w:rPr>
-              <w:t>}}</w:t>
+              <w:t>{{v.II.1.a.9}}</w:t>
             </w:r>
           </w:p>
         </w:tc>
@@ -12174,7 +11772,7 @@
         </w:trPr>
         <w:tc>
           <w:tcPr>
-            <w:tcW w:w="579" w:type="pct"/>
+            <w:tcW w:w="538" w:type="pct"/>
             <w:tcBorders>
               <w:top w:val="single" w:sz="6" w:space="0" w:color="auto"/>
               <w:left w:val="single" w:sz="6" w:space="0" w:color="auto"/>
@@ -12200,7 +11798,7 @@
         </w:tc>
         <w:tc>
           <w:tcPr>
-            <w:tcW w:w="2631" w:type="pct"/>
+            <w:tcW w:w="2591" w:type="pct"/>
             <w:tcBorders>
               <w:top w:val="single" w:sz="6" w:space="0" w:color="auto"/>
               <w:left w:val="single" w:sz="6" w:space="0" w:color="auto"/>
@@ -12233,7 +11831,7 @@
         </w:tc>
         <w:tc>
           <w:tcPr>
-            <w:tcW w:w="1244" w:type="pct"/>
+            <w:tcW w:w="1203" w:type="pct"/>
             <w:tcBorders>
               <w:top w:val="single" w:sz="6" w:space="0" w:color="auto"/>
               <w:left w:val="single" w:sz="6" w:space="0" w:color="auto"/>
@@ -12256,7 +11854,7 @@
         </w:tc>
         <w:tc>
           <w:tcPr>
-            <w:tcW w:w="546" w:type="pct"/>
+            <w:tcW w:w="668" w:type="pct"/>
             <w:tcBorders>
               <w:top w:val="single" w:sz="6" w:space="0" w:color="auto"/>
               <w:left w:val="single" w:sz="6" w:space="0" w:color="auto"/>
@@ -12272,23 +11870,13 @@
               <w:spacing w:before="54" w:after="66"/>
               <w:jc w:val="center"/>
               <w:rPr>
-                <w:rFonts w:asciiTheme="minorHAnsi" w:eastAsia="等线" w:hAnsiTheme="minorHAnsi" w:cs="Calibri"/>
-                <w:spacing w:val="-2"/>
-                <w:sz w:val="22"/>
-                <w:szCs w:val="22"/>
-                <w:lang w:eastAsia="zh-CN"/>
-              </w:rPr>
-            </w:pPr>
-            <w:r>
-              <w:rPr>
                 <w:rFonts w:asciiTheme="minorHAnsi" w:eastAsia="等线" w:hAnsiTheme="minorHAnsi" w:cs="Calibri" w:hint="eastAsia"/>
                 <w:spacing w:val="-2"/>
                 <w:sz w:val="22"/>
                 <w:szCs w:val="22"/>
                 <w:lang w:eastAsia="zh-CN"/>
               </w:rPr>
-              <w:t>{{v</w:t>
-            </w:r>
+            </w:pPr>
             <w:r>
               <w:rPr>
                 <w:rFonts w:asciiTheme="minorHAnsi" w:eastAsia="等线" w:hAnsiTheme="minorHAnsi" w:cs="Calibri" w:hint="eastAsia"/>
@@ -12297,37 +11885,7 @@
                 <w:szCs w:val="22"/>
                 <w:lang w:eastAsia="zh-CN"/>
               </w:rPr>
-              <w:t>.II</w:t>
-            </w:r>
-            <w:r>
-              <w:rPr>
-                <w:rFonts w:asciiTheme="minorHAnsi" w:eastAsia="等线" w:hAnsiTheme="minorHAnsi" w:cs="Calibri" w:hint="eastAsia"/>
-                <w:spacing w:val="-2"/>
-                <w:sz w:val="22"/>
-                <w:szCs w:val="22"/>
-                <w:lang w:eastAsia="zh-CN"/>
-              </w:rPr>
-              <w:t>.1.a.</w:t>
-            </w:r>
-            <w:r>
-              <w:rPr>
-                <w:rFonts w:asciiTheme="minorHAnsi" w:eastAsia="等线" w:hAnsiTheme="minorHAnsi" w:cs="Calibri" w:hint="eastAsia"/>
-                <w:spacing w:val="-2"/>
-                <w:sz w:val="22"/>
-                <w:szCs w:val="22"/>
-                <w:lang w:eastAsia="zh-CN"/>
-              </w:rPr>
-              <w:t>11</w:t>
-            </w:r>
-            <w:r>
-              <w:rPr>
-                <w:rFonts w:asciiTheme="minorHAnsi" w:eastAsia="等线" w:hAnsiTheme="minorHAnsi" w:cs="Calibri" w:hint="eastAsia"/>
-                <w:spacing w:val="-2"/>
-                <w:sz w:val="22"/>
-                <w:szCs w:val="22"/>
-                <w:lang w:eastAsia="zh-CN"/>
-              </w:rPr>
-              <w:t>}}</w:t>
+              <w:t>{{v.II.1.a.10}}</w:t>
             </w:r>
           </w:p>
         </w:tc>
@@ -12339,7 +11897,7 @@
         </w:trPr>
         <w:tc>
           <w:tcPr>
-            <w:tcW w:w="579" w:type="pct"/>
+            <w:tcW w:w="538" w:type="pct"/>
             <w:tcBorders>
               <w:top w:val="single" w:sz="6" w:space="0" w:color="auto"/>
               <w:left w:val="single" w:sz="6" w:space="0" w:color="auto"/>
@@ -12365,7 +11923,7 @@
         </w:tc>
         <w:tc>
           <w:tcPr>
-            <w:tcW w:w="2631" w:type="pct"/>
+            <w:tcW w:w="2591" w:type="pct"/>
             <w:tcBorders>
               <w:top w:val="single" w:sz="6" w:space="0" w:color="auto"/>
               <w:left w:val="single" w:sz="6" w:space="0" w:color="auto"/>
@@ -12399,7 +11957,7 @@
         </w:tc>
         <w:tc>
           <w:tcPr>
-            <w:tcW w:w="1244" w:type="pct"/>
+            <w:tcW w:w="1203" w:type="pct"/>
             <w:tcBorders>
               <w:top w:val="single" w:sz="6" w:space="0" w:color="auto"/>
               <w:left w:val="single" w:sz="6" w:space="0" w:color="auto"/>
@@ -12423,7 +11981,7 @@
         </w:tc>
         <w:tc>
           <w:tcPr>
-            <w:tcW w:w="546" w:type="pct"/>
+            <w:tcW w:w="668" w:type="pct"/>
             <w:tcBorders>
               <w:top w:val="single" w:sz="6" w:space="0" w:color="auto"/>
               <w:left w:val="single" w:sz="6" w:space="0" w:color="auto"/>
@@ -12439,23 +11997,13 @@
               <w:spacing w:before="54" w:after="66"/>
               <w:jc w:val="center"/>
               <w:rPr>
-                <w:rFonts w:asciiTheme="minorHAnsi" w:eastAsia="等线" w:hAnsiTheme="minorHAnsi" w:cs="Calibri"/>
-                <w:spacing w:val="-2"/>
-                <w:sz w:val="22"/>
-                <w:szCs w:val="22"/>
-                <w:lang w:eastAsia="zh-CN"/>
-              </w:rPr>
-            </w:pPr>
-            <w:r>
-              <w:rPr>
                 <w:rFonts w:asciiTheme="minorHAnsi" w:eastAsia="等线" w:hAnsiTheme="minorHAnsi" w:cs="Calibri" w:hint="eastAsia"/>
                 <w:spacing w:val="-2"/>
                 <w:sz w:val="22"/>
                 <w:szCs w:val="22"/>
                 <w:lang w:eastAsia="zh-CN"/>
               </w:rPr>
-              <w:t>{{v</w:t>
-            </w:r>
+            </w:pPr>
             <w:r>
               <w:rPr>
                 <w:rFonts w:asciiTheme="minorHAnsi" w:eastAsia="等线" w:hAnsiTheme="minorHAnsi" w:cs="Calibri" w:hint="eastAsia"/>
@@ -12464,37 +12012,7 @@
                 <w:szCs w:val="22"/>
                 <w:lang w:eastAsia="zh-CN"/>
               </w:rPr>
-              <w:t>.II</w:t>
-            </w:r>
-            <w:r>
-              <w:rPr>
-                <w:rFonts w:asciiTheme="minorHAnsi" w:eastAsia="等线" w:hAnsiTheme="minorHAnsi" w:cs="Calibri" w:hint="eastAsia"/>
-                <w:spacing w:val="-2"/>
-                <w:sz w:val="22"/>
-                <w:szCs w:val="22"/>
-                <w:lang w:eastAsia="zh-CN"/>
-              </w:rPr>
-              <w:t>.1.a.</w:t>
-            </w:r>
-            <w:r>
-              <w:rPr>
-                <w:rFonts w:asciiTheme="minorHAnsi" w:eastAsia="等线" w:hAnsiTheme="minorHAnsi" w:cs="Calibri" w:hint="eastAsia"/>
-                <w:spacing w:val="-2"/>
-                <w:sz w:val="22"/>
-                <w:szCs w:val="22"/>
-                <w:lang w:eastAsia="zh-CN"/>
-              </w:rPr>
-              <w:t>12</w:t>
-            </w:r>
-            <w:r>
-              <w:rPr>
-                <w:rFonts w:asciiTheme="minorHAnsi" w:eastAsia="等线" w:hAnsiTheme="minorHAnsi" w:cs="Calibri" w:hint="eastAsia"/>
-                <w:spacing w:val="-2"/>
-                <w:sz w:val="22"/>
-                <w:szCs w:val="22"/>
-                <w:lang w:eastAsia="zh-CN"/>
-              </w:rPr>
-              <w:t>}}</w:t>
+              <w:t>{{v.II.1.a.11}}</w:t>
             </w:r>
           </w:p>
         </w:tc>
@@ -12506,7 +12024,7 @@
         </w:trPr>
         <w:tc>
           <w:tcPr>
-            <w:tcW w:w="579" w:type="pct"/>
+            <w:tcW w:w="538" w:type="pct"/>
             <w:tcBorders>
               <w:top w:val="single" w:sz="6" w:space="0" w:color="auto"/>
               <w:left w:val="single" w:sz="6" w:space="0" w:color="auto"/>
@@ -12532,7 +12050,7 @@
         </w:tc>
         <w:tc>
           <w:tcPr>
-            <w:tcW w:w="2631" w:type="pct"/>
+            <w:tcW w:w="2591" w:type="pct"/>
             <w:tcBorders>
               <w:top w:val="single" w:sz="6" w:space="0" w:color="auto"/>
               <w:left w:val="single" w:sz="6" w:space="0" w:color="auto"/>
@@ -12566,7 +12084,7 @@
         </w:tc>
         <w:tc>
           <w:tcPr>
-            <w:tcW w:w="1244" w:type="pct"/>
+            <w:tcW w:w="1203" w:type="pct"/>
             <w:tcBorders>
               <w:top w:val="single" w:sz="6" w:space="0" w:color="auto"/>
               <w:left w:val="single" w:sz="6" w:space="0" w:color="auto"/>
@@ -12590,7 +12108,7 @@
         </w:tc>
         <w:tc>
           <w:tcPr>
-            <w:tcW w:w="546" w:type="pct"/>
+            <w:tcW w:w="668" w:type="pct"/>
             <w:tcBorders>
               <w:top w:val="single" w:sz="6" w:space="0" w:color="auto"/>
               <w:left w:val="single" w:sz="6" w:space="0" w:color="auto"/>
@@ -12606,23 +12124,13 @@
               <w:spacing w:before="54" w:after="66"/>
               <w:jc w:val="center"/>
               <w:rPr>
-                <w:rFonts w:asciiTheme="minorHAnsi" w:eastAsia="等线" w:hAnsiTheme="minorHAnsi" w:cs="Calibri"/>
-                <w:spacing w:val="-2"/>
-                <w:sz w:val="22"/>
-                <w:szCs w:val="22"/>
-                <w:lang w:eastAsia="zh-CN"/>
-              </w:rPr>
-            </w:pPr>
-            <w:r>
-              <w:rPr>
                 <w:rFonts w:asciiTheme="minorHAnsi" w:eastAsia="等线" w:hAnsiTheme="minorHAnsi" w:cs="Calibri" w:hint="eastAsia"/>
                 <w:spacing w:val="-2"/>
                 <w:sz w:val="22"/>
                 <w:szCs w:val="22"/>
                 <w:lang w:eastAsia="zh-CN"/>
               </w:rPr>
-              <w:t>{{v</w:t>
-            </w:r>
+            </w:pPr>
             <w:r>
               <w:rPr>
                 <w:rFonts w:asciiTheme="minorHAnsi" w:eastAsia="等线" w:hAnsiTheme="minorHAnsi" w:cs="Calibri" w:hint="eastAsia"/>
@@ -12631,37 +12139,7 @@
                 <w:szCs w:val="22"/>
                 <w:lang w:eastAsia="zh-CN"/>
               </w:rPr>
-              <w:t>.II</w:t>
-            </w:r>
-            <w:r>
-              <w:rPr>
-                <w:rFonts w:asciiTheme="minorHAnsi" w:eastAsia="等线" w:hAnsiTheme="minorHAnsi" w:cs="Calibri" w:hint="eastAsia"/>
-                <w:spacing w:val="-2"/>
-                <w:sz w:val="22"/>
-                <w:szCs w:val="22"/>
-                <w:lang w:eastAsia="zh-CN"/>
-              </w:rPr>
-              <w:t>.1.a.</w:t>
-            </w:r>
-            <w:r>
-              <w:rPr>
-                <w:rFonts w:asciiTheme="minorHAnsi" w:eastAsia="等线" w:hAnsiTheme="minorHAnsi" w:cs="Calibri" w:hint="eastAsia"/>
-                <w:spacing w:val="-2"/>
-                <w:sz w:val="22"/>
-                <w:szCs w:val="22"/>
-                <w:lang w:eastAsia="zh-CN"/>
-              </w:rPr>
-              <w:t>13</w:t>
-            </w:r>
-            <w:r>
-              <w:rPr>
-                <w:rFonts w:asciiTheme="minorHAnsi" w:eastAsia="等线" w:hAnsiTheme="minorHAnsi" w:cs="Calibri" w:hint="eastAsia"/>
-                <w:spacing w:val="-2"/>
-                <w:sz w:val="22"/>
-                <w:szCs w:val="22"/>
-                <w:lang w:eastAsia="zh-CN"/>
-              </w:rPr>
-              <w:t>}}</w:t>
+              <w:t>{{v.II.1.a.12}}</w:t>
             </w:r>
           </w:p>
         </w:tc>
@@ -12673,7 +12151,7 @@
         </w:trPr>
         <w:tc>
           <w:tcPr>
-            <w:tcW w:w="579" w:type="pct"/>
+            <w:tcW w:w="538" w:type="pct"/>
             <w:tcBorders>
               <w:top w:val="single" w:sz="6" w:space="0" w:color="auto"/>
               <w:left w:val="single" w:sz="6" w:space="0" w:color="auto"/>
@@ -12699,7 +12177,7 @@
         </w:tc>
         <w:tc>
           <w:tcPr>
-            <w:tcW w:w="2631" w:type="pct"/>
+            <w:tcW w:w="2591" w:type="pct"/>
             <w:tcBorders>
               <w:top w:val="single" w:sz="6" w:space="0" w:color="auto"/>
               <w:left w:val="single" w:sz="6" w:space="0" w:color="auto"/>
@@ -12733,7 +12211,7 @@
         </w:tc>
         <w:tc>
           <w:tcPr>
-            <w:tcW w:w="1244" w:type="pct"/>
+            <w:tcW w:w="1203" w:type="pct"/>
             <w:tcBorders>
               <w:top w:val="single" w:sz="6" w:space="0" w:color="auto"/>
               <w:left w:val="single" w:sz="6" w:space="0" w:color="auto"/>
@@ -12757,7 +12235,7 @@
         </w:tc>
         <w:tc>
           <w:tcPr>
-            <w:tcW w:w="546" w:type="pct"/>
+            <w:tcW w:w="668" w:type="pct"/>
             <w:tcBorders>
               <w:top w:val="single" w:sz="6" w:space="0" w:color="auto"/>
               <w:left w:val="single" w:sz="6" w:space="0" w:color="auto"/>
@@ -12773,23 +12251,13 @@
               <w:spacing w:before="54" w:after="66"/>
               <w:jc w:val="center"/>
               <w:rPr>
-                <w:rFonts w:asciiTheme="minorHAnsi" w:eastAsia="等线" w:hAnsiTheme="minorHAnsi" w:cs="Calibri"/>
-                <w:spacing w:val="-2"/>
-                <w:sz w:val="22"/>
-                <w:szCs w:val="22"/>
-                <w:lang w:eastAsia="zh-CN"/>
-              </w:rPr>
-            </w:pPr>
-            <w:r>
-              <w:rPr>
                 <w:rFonts w:asciiTheme="minorHAnsi" w:eastAsia="等线" w:hAnsiTheme="minorHAnsi" w:cs="Calibri" w:hint="eastAsia"/>
                 <w:spacing w:val="-2"/>
                 <w:sz w:val="22"/>
                 <w:szCs w:val="22"/>
                 <w:lang w:eastAsia="zh-CN"/>
               </w:rPr>
-              <w:t>{{v</w:t>
-            </w:r>
+            </w:pPr>
             <w:r>
               <w:rPr>
                 <w:rFonts w:asciiTheme="minorHAnsi" w:eastAsia="等线" w:hAnsiTheme="minorHAnsi" w:cs="Calibri" w:hint="eastAsia"/>
@@ -12798,37 +12266,7 @@
                 <w:szCs w:val="22"/>
                 <w:lang w:eastAsia="zh-CN"/>
               </w:rPr>
-              <w:t>.II</w:t>
-            </w:r>
-            <w:r>
-              <w:rPr>
-                <w:rFonts w:asciiTheme="minorHAnsi" w:eastAsia="等线" w:hAnsiTheme="minorHAnsi" w:cs="Calibri" w:hint="eastAsia"/>
-                <w:spacing w:val="-2"/>
-                <w:sz w:val="22"/>
-                <w:szCs w:val="22"/>
-                <w:lang w:eastAsia="zh-CN"/>
-              </w:rPr>
-              <w:t>.1.a.</w:t>
-            </w:r>
-            <w:r>
-              <w:rPr>
-                <w:rFonts w:asciiTheme="minorHAnsi" w:eastAsia="等线" w:hAnsiTheme="minorHAnsi" w:cs="Calibri" w:hint="eastAsia"/>
-                <w:spacing w:val="-2"/>
-                <w:sz w:val="22"/>
-                <w:szCs w:val="22"/>
-                <w:lang w:eastAsia="zh-CN"/>
-              </w:rPr>
-              <w:t>14</w:t>
-            </w:r>
-            <w:r>
-              <w:rPr>
-                <w:rFonts w:asciiTheme="minorHAnsi" w:eastAsia="等线" w:hAnsiTheme="minorHAnsi" w:cs="Calibri" w:hint="eastAsia"/>
-                <w:spacing w:val="-2"/>
-                <w:sz w:val="22"/>
-                <w:szCs w:val="22"/>
-                <w:lang w:eastAsia="zh-CN"/>
-              </w:rPr>
-              <w:t>}}</w:t>
+              <w:t>{{v.II.1.a.13}}</w:t>
             </w:r>
           </w:p>
         </w:tc>
@@ -12840,7 +12278,7 @@
         </w:trPr>
         <w:tc>
           <w:tcPr>
-            <w:tcW w:w="579" w:type="pct"/>
+            <w:tcW w:w="538" w:type="pct"/>
             <w:tcBorders>
               <w:top w:val="single" w:sz="6" w:space="0" w:color="auto"/>
               <w:left w:val="single" w:sz="6" w:space="0" w:color="auto"/>
@@ -12866,7 +12304,7 @@
         </w:tc>
         <w:tc>
           <w:tcPr>
-            <w:tcW w:w="2631" w:type="pct"/>
+            <w:tcW w:w="2591" w:type="pct"/>
             <w:tcBorders>
               <w:top w:val="single" w:sz="6" w:space="0" w:color="auto"/>
               <w:left w:val="single" w:sz="6" w:space="0" w:color="auto"/>
@@ -12900,7 +12338,7 @@
         </w:tc>
         <w:tc>
           <w:tcPr>
-            <w:tcW w:w="1244" w:type="pct"/>
+            <w:tcW w:w="1203" w:type="pct"/>
             <w:tcBorders>
               <w:top w:val="single" w:sz="6" w:space="0" w:color="auto"/>
               <w:left w:val="single" w:sz="6" w:space="0" w:color="auto"/>
@@ -12924,7 +12362,7 @@
         </w:tc>
         <w:tc>
           <w:tcPr>
-            <w:tcW w:w="546" w:type="pct"/>
+            <w:tcW w:w="668" w:type="pct"/>
             <w:tcBorders>
               <w:top w:val="single" w:sz="6" w:space="0" w:color="auto"/>
               <w:left w:val="single" w:sz="6" w:space="0" w:color="auto"/>
@@ -12940,23 +12378,13 @@
               <w:spacing w:before="54" w:after="66"/>
               <w:jc w:val="center"/>
               <w:rPr>
-                <w:rFonts w:asciiTheme="minorHAnsi" w:eastAsia="等线" w:hAnsiTheme="minorHAnsi" w:cs="Calibri"/>
-                <w:spacing w:val="-2"/>
-                <w:sz w:val="22"/>
-                <w:szCs w:val="22"/>
-                <w:lang w:eastAsia="zh-CN"/>
-              </w:rPr>
-            </w:pPr>
-            <w:r>
-              <w:rPr>
                 <w:rFonts w:asciiTheme="minorHAnsi" w:eastAsia="等线" w:hAnsiTheme="minorHAnsi" w:cs="Calibri" w:hint="eastAsia"/>
                 <w:spacing w:val="-2"/>
                 <w:sz w:val="22"/>
                 <w:szCs w:val="22"/>
                 <w:lang w:eastAsia="zh-CN"/>
               </w:rPr>
-              <w:t>{{v</w:t>
-            </w:r>
+            </w:pPr>
             <w:r>
               <w:rPr>
                 <w:rFonts w:asciiTheme="minorHAnsi" w:eastAsia="等线" w:hAnsiTheme="minorHAnsi" w:cs="Calibri" w:hint="eastAsia"/>
@@ -12965,37 +12393,7 @@
                 <w:szCs w:val="22"/>
                 <w:lang w:eastAsia="zh-CN"/>
               </w:rPr>
-              <w:t>.II</w:t>
-            </w:r>
-            <w:r>
-              <w:rPr>
-                <w:rFonts w:asciiTheme="minorHAnsi" w:eastAsia="等线" w:hAnsiTheme="minorHAnsi" w:cs="Calibri" w:hint="eastAsia"/>
-                <w:spacing w:val="-2"/>
-                <w:sz w:val="22"/>
-                <w:szCs w:val="22"/>
-                <w:lang w:eastAsia="zh-CN"/>
-              </w:rPr>
-              <w:t>.1.a.</w:t>
-            </w:r>
-            <w:r>
-              <w:rPr>
-                <w:rFonts w:asciiTheme="minorHAnsi" w:eastAsia="等线" w:hAnsiTheme="minorHAnsi" w:cs="Calibri" w:hint="eastAsia"/>
-                <w:spacing w:val="-2"/>
-                <w:sz w:val="22"/>
-                <w:szCs w:val="22"/>
-                <w:lang w:eastAsia="zh-CN"/>
-              </w:rPr>
-              <w:t>15</w:t>
-            </w:r>
-            <w:r>
-              <w:rPr>
-                <w:rFonts w:asciiTheme="minorHAnsi" w:eastAsia="等线" w:hAnsiTheme="minorHAnsi" w:cs="Calibri" w:hint="eastAsia"/>
-                <w:spacing w:val="-2"/>
-                <w:sz w:val="22"/>
-                <w:szCs w:val="22"/>
-                <w:lang w:eastAsia="zh-CN"/>
-              </w:rPr>
-              <w:t>}}</w:t>
+              <w:t>{{v.II.1.a.14}}</w:t>
             </w:r>
           </w:p>
         </w:tc>
@@ -13007,7 +12405,7 @@
         </w:trPr>
         <w:tc>
           <w:tcPr>
-            <w:tcW w:w="579" w:type="pct"/>
+            <w:tcW w:w="538" w:type="pct"/>
             <w:tcBorders>
               <w:top w:val="single" w:sz="6" w:space="0" w:color="auto"/>
               <w:left w:val="single" w:sz="6" w:space="0" w:color="auto"/>
@@ -13033,7 +12431,7 @@
         </w:tc>
         <w:tc>
           <w:tcPr>
-            <w:tcW w:w="2631" w:type="pct"/>
+            <w:tcW w:w="2591" w:type="pct"/>
             <w:tcBorders>
               <w:top w:val="single" w:sz="6" w:space="0" w:color="auto"/>
               <w:left w:val="single" w:sz="6" w:space="0" w:color="auto"/>
@@ -13067,7 +12465,7 @@
         </w:tc>
         <w:tc>
           <w:tcPr>
-            <w:tcW w:w="1244" w:type="pct"/>
+            <w:tcW w:w="1203" w:type="pct"/>
             <w:tcBorders>
               <w:top w:val="single" w:sz="6" w:space="0" w:color="auto"/>
               <w:left w:val="single" w:sz="6" w:space="0" w:color="auto"/>
@@ -13090,7 +12488,7 @@
         </w:tc>
         <w:tc>
           <w:tcPr>
-            <w:tcW w:w="546" w:type="pct"/>
+            <w:tcW w:w="668" w:type="pct"/>
             <w:tcBorders>
               <w:top w:val="single" w:sz="6" w:space="0" w:color="auto"/>
               <w:left w:val="single" w:sz="6" w:space="0" w:color="auto"/>
@@ -13106,23 +12504,13 @@
               <w:spacing w:before="54" w:after="66"/>
               <w:jc w:val="center"/>
               <w:rPr>
-                <w:rFonts w:asciiTheme="minorHAnsi" w:eastAsia="等线" w:hAnsiTheme="minorHAnsi" w:cs="Calibri"/>
-                <w:spacing w:val="-2"/>
-                <w:sz w:val="22"/>
-                <w:szCs w:val="22"/>
-                <w:lang w:eastAsia="zh-CN"/>
-              </w:rPr>
-            </w:pPr>
-            <w:r>
-              <w:rPr>
                 <w:rFonts w:asciiTheme="minorHAnsi" w:eastAsia="等线" w:hAnsiTheme="minorHAnsi" w:cs="Calibri" w:hint="eastAsia"/>
                 <w:spacing w:val="-2"/>
                 <w:sz w:val="22"/>
                 <w:szCs w:val="22"/>
                 <w:lang w:eastAsia="zh-CN"/>
               </w:rPr>
-              <w:t>{{v</w:t>
-            </w:r>
+            </w:pPr>
             <w:r>
               <w:rPr>
                 <w:rFonts w:asciiTheme="minorHAnsi" w:eastAsia="等线" w:hAnsiTheme="minorHAnsi" w:cs="Calibri" w:hint="eastAsia"/>
@@ -13131,37 +12519,7 @@
                 <w:szCs w:val="22"/>
                 <w:lang w:eastAsia="zh-CN"/>
               </w:rPr>
-              <w:t>.II</w:t>
-            </w:r>
-            <w:r>
-              <w:rPr>
-                <w:rFonts w:asciiTheme="minorHAnsi" w:eastAsia="等线" w:hAnsiTheme="minorHAnsi" w:cs="Calibri" w:hint="eastAsia"/>
-                <w:spacing w:val="-2"/>
-                <w:sz w:val="22"/>
-                <w:szCs w:val="22"/>
-                <w:lang w:eastAsia="zh-CN"/>
-              </w:rPr>
-              <w:t>.1.a.</w:t>
-            </w:r>
-            <w:r>
-              <w:rPr>
-                <w:rFonts w:asciiTheme="minorHAnsi" w:eastAsia="等线" w:hAnsiTheme="minorHAnsi" w:cs="Calibri" w:hint="eastAsia"/>
-                <w:spacing w:val="-2"/>
-                <w:sz w:val="22"/>
-                <w:szCs w:val="22"/>
-                <w:lang w:eastAsia="zh-CN"/>
-              </w:rPr>
-              <w:t>16</w:t>
-            </w:r>
-            <w:r>
-              <w:rPr>
-                <w:rFonts w:asciiTheme="minorHAnsi" w:eastAsia="等线" w:hAnsiTheme="minorHAnsi" w:cs="Calibri" w:hint="eastAsia"/>
-                <w:spacing w:val="-2"/>
-                <w:sz w:val="22"/>
-                <w:szCs w:val="22"/>
-                <w:lang w:eastAsia="zh-CN"/>
-              </w:rPr>
-              <w:t>}}</w:t>
+              <w:t>{{v.II.1.a.15}}</w:t>
             </w:r>
           </w:p>
         </w:tc>
@@ -13470,7 +12828,7 @@
               <w:spacing w:before="54" w:after="66"/>
               <w:jc w:val="center"/>
               <w:rPr>
-                <w:rFonts w:ascii="Calibri" w:hAnsi="Calibri" w:cs="Calibri"/>
+                <w:rFonts w:ascii="Calibri" w:hAnsi="Calibri" w:cs="Calibri" w:hint="eastAsia"/>
                 <w:spacing w:val="-2"/>
                 <w:sz w:val="22"/>
                 <w:szCs w:val="22"/>
@@ -13479,13 +12837,13 @@
             </w:pPr>
             <w:r>
               <w:rPr>
-                <w:rFonts w:asciiTheme="minorHAnsi" w:eastAsia="等线" w:hAnsiTheme="minorHAnsi" w:cs="Calibri" w:hint="eastAsia"/>
+                <w:rFonts w:ascii="Calibri" w:hAnsi="Calibri" w:cs="Calibri" w:hint="eastAsia"/>
                 <w:spacing w:val="-2"/>
                 <w:sz w:val="22"/>
                 <w:szCs w:val="22"/>
                 <w:lang w:eastAsia="zh-CN"/>
               </w:rPr>
-              <w:t>{{v.II.1.a}}</w:t>
+              <w:t>{{v.II.1.as}}</w:t>
             </w:r>
           </w:p>
         </w:tc>
@@ -13609,7 +12967,7 @@
               <w:spacing w:before="54" w:after="66"/>
               <w:jc w:val="center"/>
               <w:rPr>
-                <w:rFonts w:ascii="Calibri" w:hAnsi="Calibri" w:cs="Calibri"/>
+                <w:rFonts w:ascii="Calibri" w:hAnsi="Calibri" w:cs="Calibri" w:hint="eastAsia"/>
                 <w:spacing w:val="-2"/>
                 <w:sz w:val="22"/>
                 <w:szCs w:val="22"/>
@@ -13618,13 +12976,13 @@
             </w:pPr>
             <w:r>
               <w:rPr>
-                <w:rFonts w:asciiTheme="minorHAnsi" w:eastAsia="等线" w:hAnsiTheme="minorHAnsi" w:cs="Calibri" w:hint="eastAsia"/>
+                <w:rFonts w:ascii="Calibri" w:hAnsi="Calibri" w:cs="Calibri" w:hint="eastAsia"/>
                 <w:spacing w:val="-2"/>
                 <w:sz w:val="22"/>
                 <w:szCs w:val="22"/>
                 <w:lang w:eastAsia="zh-CN"/>
               </w:rPr>
-              <w:t>{{v.II.1.a.1}}</w:t>
+              <w:t>{{v.II.1.as.1}}</w:t>
             </w:r>
           </w:p>
         </w:tc>
@@ -13748,7 +13106,7 @@
               <w:spacing w:before="54" w:after="66"/>
               <w:jc w:val="center"/>
               <w:rPr>
-                <w:rFonts w:ascii="Calibri" w:hAnsi="Calibri" w:cs="Calibri"/>
+                <w:rFonts w:ascii="Calibri" w:hAnsi="Calibri" w:cs="Calibri" w:hint="eastAsia"/>
                 <w:spacing w:val="-2"/>
                 <w:sz w:val="22"/>
                 <w:szCs w:val="22"/>
@@ -13757,13 +13115,13 @@
             </w:pPr>
             <w:r>
               <w:rPr>
-                <w:rFonts w:asciiTheme="minorHAnsi" w:eastAsia="等线" w:hAnsiTheme="minorHAnsi" w:cs="Calibri" w:hint="eastAsia"/>
+                <w:rFonts w:ascii="Calibri" w:hAnsi="Calibri" w:cs="Calibri" w:hint="eastAsia"/>
                 <w:spacing w:val="-2"/>
                 <w:sz w:val="22"/>
                 <w:szCs w:val="22"/>
                 <w:lang w:eastAsia="zh-CN"/>
               </w:rPr>
-              <w:t>{{v.II.1.a.2}}</w:t>
+              <w:t>{{v.II.1.as.2}}</w:t>
             </w:r>
           </w:p>
         </w:tc>
@@ -13904,7 +13262,7 @@
               <w:spacing w:before="54" w:after="66"/>
               <w:jc w:val="center"/>
               <w:rPr>
-                <w:rFonts w:ascii="Calibri" w:hAnsi="Calibri" w:cs="Calibri"/>
+                <w:rFonts w:ascii="Calibri" w:hAnsi="Calibri" w:cs="Calibri" w:hint="eastAsia"/>
                 <w:spacing w:val="-2"/>
                 <w:sz w:val="22"/>
                 <w:szCs w:val="22"/>
@@ -13913,13 +13271,13 @@
             </w:pPr>
             <w:r>
               <w:rPr>
-                <w:rFonts w:asciiTheme="minorHAnsi" w:eastAsia="等线" w:hAnsiTheme="minorHAnsi" w:cs="Calibri" w:hint="eastAsia"/>
+                <w:rFonts w:ascii="Calibri" w:hAnsi="Calibri" w:cs="Calibri" w:hint="eastAsia"/>
                 <w:spacing w:val="-2"/>
                 <w:sz w:val="22"/>
                 <w:szCs w:val="22"/>
                 <w:lang w:eastAsia="zh-CN"/>
               </w:rPr>
-              <w:t>{{v.II.1.a.3}}</w:t>
+              <w:t>{{v.II.1.as.3}}</w:t>
             </w:r>
           </w:p>
         </w:tc>
@@ -14382,7 +13740,7 @@
                 <w:noProof/>
               </w:rPr>
               <w:drawing>
-                <wp:inline distT="0" distB="0" distL="0" distR="0" wp14:anchorId="1EA0DD81" wp14:editId="7109ECE6">
+                <wp:inline distT="0" distB="0" distL="0" distR="0" wp14:anchorId="1EA0DD81" wp14:editId="1EBEEB0E">
                   <wp:extent cx="1571625" cy="180975"/>
                   <wp:effectExtent l="0" t="0" r="9525" b="9525"/>
                   <wp:docPr id="7" name="Picture 7"/>
@@ -14770,7 +14128,7 @@
               <w:spacing w:before="54" w:after="66"/>
               <w:jc w:val="center"/>
               <w:rPr>
-                <w:rFonts w:ascii="Calibri" w:hAnsi="Calibri" w:cs="Calibri"/>
+                <w:rFonts w:ascii="Calibri" w:hAnsi="Calibri" w:cs="Calibri" w:hint="eastAsia"/>
                 <w:spacing w:val="-2"/>
                 <w:sz w:val="22"/>
                 <w:szCs w:val="22"/>
@@ -14779,33 +14137,13 @@
             </w:pPr>
             <w:r>
               <w:rPr>
-                <w:rFonts w:asciiTheme="minorHAnsi" w:eastAsia="等线" w:hAnsiTheme="minorHAnsi" w:cs="Calibri" w:hint="eastAsia"/>
+                <w:rFonts w:ascii="Calibri" w:hAnsi="Calibri" w:cs="Calibri" w:hint="eastAsia"/>
                 <w:spacing w:val="-2"/>
                 <w:sz w:val="22"/>
                 <w:szCs w:val="22"/>
                 <w:lang w:eastAsia="zh-CN"/>
               </w:rPr>
-              <w:t>{{v.II.1.b</w:t>
-            </w:r>
-            <w:r>
-              <w:rPr>
-                <w:rFonts w:asciiTheme="minorHAnsi" w:eastAsia="等线" w:hAnsiTheme="minorHAnsi" w:cs="Calibri" w:hint="eastAsia"/>
-                <w:spacing w:val="-2"/>
-                <w:sz w:val="22"/>
-                <w:szCs w:val="22"/>
-                <w:lang w:eastAsia="zh-CN"/>
-              </w:rPr>
-              <w:t>.3</w:t>
-            </w:r>
-            <w:r>
-              <w:rPr>
-                <w:rFonts w:asciiTheme="minorHAnsi" w:eastAsia="等线" w:hAnsiTheme="minorHAnsi" w:cs="Calibri" w:hint="eastAsia"/>
-                <w:spacing w:val="-2"/>
-                <w:sz w:val="22"/>
-                <w:szCs w:val="22"/>
-                <w:lang w:eastAsia="zh-CN"/>
-              </w:rPr>
-              <w:t>}}</w:t>
+              <w:t>{{v.II.1.b.3}}</w:t>
             </w:r>
           </w:p>
         </w:tc>
@@ -14929,7 +14267,7 @@
               <w:spacing w:before="54" w:after="66"/>
               <w:jc w:val="center"/>
               <w:rPr>
-                <w:rFonts w:ascii="Calibri" w:hAnsi="Calibri" w:cs="Calibri"/>
+                <w:rFonts w:ascii="Calibri" w:hAnsi="Calibri" w:cs="Calibri" w:hint="eastAsia"/>
                 <w:color w:val="FF0000"/>
                 <w:spacing w:val="-2"/>
                 <w:sz w:val="22"/>
@@ -14939,33 +14277,14 @@
             </w:pPr>
             <w:r>
               <w:rPr>
-                <w:rFonts w:asciiTheme="minorHAnsi" w:eastAsia="等线" w:hAnsiTheme="minorHAnsi" w:cs="Calibri" w:hint="eastAsia"/>
+                <w:rFonts w:ascii="Calibri" w:hAnsi="Calibri" w:cs="Calibri" w:hint="eastAsia"/>
+                <w:color w:val="FF0000"/>
                 <w:spacing w:val="-2"/>
                 <w:sz w:val="22"/>
                 <w:szCs w:val="22"/>
                 <w:lang w:eastAsia="zh-CN"/>
               </w:rPr>
-              <w:t>{{v.II.1.b</w:t>
-            </w:r>
-            <w:r>
-              <w:rPr>
-                <w:rFonts w:asciiTheme="minorHAnsi" w:eastAsia="等线" w:hAnsiTheme="minorHAnsi" w:cs="Calibri" w:hint="eastAsia"/>
-                <w:spacing w:val="-2"/>
-                <w:sz w:val="22"/>
-                <w:szCs w:val="22"/>
-                <w:lang w:eastAsia="zh-CN"/>
-              </w:rPr>
-              <w:t>.4</w:t>
-            </w:r>
-            <w:r>
-              <w:rPr>
-                <w:rFonts w:asciiTheme="minorHAnsi" w:eastAsia="等线" w:hAnsiTheme="minorHAnsi" w:cs="Calibri" w:hint="eastAsia"/>
-                <w:spacing w:val="-2"/>
-                <w:sz w:val="22"/>
-                <w:szCs w:val="22"/>
-                <w:lang w:eastAsia="zh-CN"/>
-              </w:rPr>
-              <w:t>}}</w:t>
+              <w:t>{{v.II.1.b.4}}</w:t>
             </w:r>
           </w:p>
         </w:tc>
@@ -15106,7 +14425,7 @@
               <w:spacing w:before="54" w:after="66"/>
               <w:jc w:val="center"/>
               <w:rPr>
-                <w:rFonts w:ascii="Calibri" w:hAnsi="Calibri" w:cs="Calibri"/>
+                <w:rFonts w:ascii="Calibri" w:hAnsi="Calibri" w:cs="Calibri" w:hint="eastAsia"/>
                 <w:color w:val="FF0000"/>
                 <w:spacing w:val="-2"/>
                 <w:sz w:val="22"/>
@@ -15116,33 +14435,13 @@
             </w:pPr>
             <w:r>
               <w:rPr>
-                <w:rFonts w:asciiTheme="minorHAnsi" w:eastAsia="等线" w:hAnsiTheme="minorHAnsi" w:cs="Calibri" w:hint="eastAsia"/>
+                <w:rFonts w:ascii="Calibri" w:hAnsi="Calibri" w:cs="Calibri" w:hint="eastAsia"/>
                 <w:spacing w:val="-2"/>
                 <w:sz w:val="22"/>
                 <w:szCs w:val="22"/>
                 <w:lang w:eastAsia="zh-CN"/>
               </w:rPr>
-              <w:t>{{v.II.1.b</w:t>
-            </w:r>
-            <w:r>
-              <w:rPr>
-                <w:rFonts w:asciiTheme="minorHAnsi" w:eastAsia="等线" w:hAnsiTheme="minorHAnsi" w:cs="Calibri" w:hint="eastAsia"/>
-                <w:spacing w:val="-2"/>
-                <w:sz w:val="22"/>
-                <w:szCs w:val="22"/>
-                <w:lang w:eastAsia="zh-CN"/>
-              </w:rPr>
-              <w:t>.5</w:t>
-            </w:r>
-            <w:r>
-              <w:rPr>
-                <w:rFonts w:asciiTheme="minorHAnsi" w:eastAsia="等线" w:hAnsiTheme="minorHAnsi" w:cs="Calibri" w:hint="eastAsia"/>
-                <w:spacing w:val="-2"/>
-                <w:sz w:val="22"/>
-                <w:szCs w:val="22"/>
-                <w:lang w:eastAsia="zh-CN"/>
-              </w:rPr>
-              <w:t>}}</w:t>
+              <w:t>{{v.II.1.b.5}}</w:t>
             </w:r>
           </w:p>
         </w:tc>
@@ -15434,7 +14733,7 @@
               <w:spacing w:before="54" w:after="66"/>
               <w:jc w:val="center"/>
               <w:rPr>
-                <w:rFonts w:asciiTheme="minorHAnsi" w:hAnsiTheme="minorHAnsi" w:cs="Calibri"/>
+                <w:rFonts w:asciiTheme="minorHAnsi" w:hAnsiTheme="minorHAnsi" w:cs="Calibri" w:hint="eastAsia"/>
                 <w:spacing w:val="-2"/>
                 <w:sz w:val="22"/>
                 <w:szCs w:val="22"/>
@@ -15443,33 +14742,13 @@
             </w:pPr>
             <w:r>
               <w:rPr>
-                <w:rFonts w:asciiTheme="minorHAnsi" w:eastAsia="等线" w:hAnsiTheme="minorHAnsi" w:cs="Calibri" w:hint="eastAsia"/>
+                <w:rFonts w:asciiTheme="minorHAnsi" w:hAnsiTheme="minorHAnsi" w:cs="Calibri" w:hint="eastAsia"/>
                 <w:spacing w:val="-2"/>
                 <w:sz w:val="22"/>
                 <w:szCs w:val="22"/>
                 <w:lang w:eastAsia="zh-CN"/>
               </w:rPr>
-              <w:t>{{v.II.</w:t>
-            </w:r>
-            <w:r>
-              <w:rPr>
-                <w:rFonts w:asciiTheme="minorHAnsi" w:eastAsia="等线" w:hAnsiTheme="minorHAnsi" w:cs="Calibri" w:hint="eastAsia"/>
-                <w:spacing w:val="-2"/>
-                <w:sz w:val="22"/>
-                <w:szCs w:val="22"/>
-                <w:lang w:eastAsia="zh-CN"/>
-              </w:rPr>
-              <w:t>2</w:t>
-            </w:r>
-            <w:r>
-              <w:rPr>
-                <w:rFonts w:asciiTheme="minorHAnsi" w:eastAsia="等线" w:hAnsiTheme="minorHAnsi" w:cs="Calibri" w:hint="eastAsia"/>
-                <w:spacing w:val="-2"/>
-                <w:sz w:val="22"/>
-                <w:szCs w:val="22"/>
-                <w:lang w:eastAsia="zh-CN"/>
-              </w:rPr>
-              <w:t>}}</w:t>
+              <w:t>{{v.II.2}}</w:t>
             </w:r>
           </w:p>
         </w:tc>
@@ -15601,7 +14880,7 @@
               <w:spacing w:before="54" w:after="66"/>
               <w:jc w:val="center"/>
               <w:rPr>
-                <w:rFonts w:asciiTheme="minorHAnsi" w:hAnsiTheme="minorHAnsi" w:cs="Calibri"/>
+                <w:rFonts w:asciiTheme="minorHAnsi" w:hAnsiTheme="minorHAnsi" w:cs="Calibri" w:hint="eastAsia"/>
                 <w:spacing w:val="-2"/>
                 <w:sz w:val="22"/>
                 <w:szCs w:val="22"/>
@@ -15610,33 +14889,13 @@
             </w:pPr>
             <w:r>
               <w:rPr>
-                <w:rFonts w:asciiTheme="minorHAnsi" w:eastAsia="等线" w:hAnsiTheme="minorHAnsi" w:cs="Calibri" w:hint="eastAsia"/>
+                <w:rFonts w:asciiTheme="minorHAnsi" w:hAnsiTheme="minorHAnsi" w:cs="Calibri" w:hint="eastAsia"/>
                 <w:spacing w:val="-2"/>
                 <w:sz w:val="22"/>
                 <w:szCs w:val="22"/>
                 <w:lang w:eastAsia="zh-CN"/>
               </w:rPr>
-              <w:t>{{v.II.2</w:t>
-            </w:r>
-            <w:r>
-              <w:rPr>
-                <w:rFonts w:asciiTheme="minorHAnsi" w:eastAsia="等线" w:hAnsiTheme="minorHAnsi" w:cs="Calibri" w:hint="eastAsia"/>
-                <w:spacing w:val="-2"/>
-                <w:sz w:val="22"/>
-                <w:szCs w:val="22"/>
-                <w:lang w:eastAsia="zh-CN"/>
-              </w:rPr>
-              <w:t>.1</w:t>
-            </w:r>
-            <w:r>
-              <w:rPr>
-                <w:rFonts w:asciiTheme="minorHAnsi" w:eastAsia="等线" w:hAnsiTheme="minorHAnsi" w:cs="Calibri" w:hint="eastAsia"/>
-                <w:spacing w:val="-2"/>
-                <w:sz w:val="22"/>
-                <w:szCs w:val="22"/>
-                <w:lang w:eastAsia="zh-CN"/>
-              </w:rPr>
-              <w:t>}}</w:t>
+              <w:t>{{v.II.2.1}}</w:t>
             </w:r>
           </w:p>
         </w:tc>
@@ -15762,7 +15021,7 @@
               <w:spacing w:before="54" w:after="66"/>
               <w:jc w:val="center"/>
               <w:rPr>
-                <w:rFonts w:asciiTheme="minorHAnsi" w:hAnsiTheme="minorHAnsi" w:cs="Calibri"/>
+                <w:rFonts w:asciiTheme="minorHAnsi" w:hAnsiTheme="minorHAnsi" w:cs="Calibri" w:hint="eastAsia"/>
                 <w:spacing w:val="-2"/>
                 <w:sz w:val="22"/>
                 <w:szCs w:val="22"/>
@@ -15771,33 +15030,13 @@
             </w:pPr>
             <w:r>
               <w:rPr>
-                <w:rFonts w:asciiTheme="minorHAnsi" w:eastAsia="等线" w:hAnsiTheme="minorHAnsi" w:cs="Calibri" w:hint="eastAsia"/>
+                <w:rFonts w:asciiTheme="minorHAnsi" w:hAnsiTheme="minorHAnsi" w:cs="Calibri" w:hint="eastAsia"/>
                 <w:spacing w:val="-2"/>
                 <w:sz w:val="22"/>
                 <w:szCs w:val="22"/>
                 <w:lang w:eastAsia="zh-CN"/>
               </w:rPr>
-              <w:t>{{v.II.2</w:t>
-            </w:r>
-            <w:r>
-              <w:rPr>
-                <w:rFonts w:asciiTheme="minorHAnsi" w:eastAsia="等线" w:hAnsiTheme="minorHAnsi" w:cs="Calibri" w:hint="eastAsia"/>
-                <w:spacing w:val="-2"/>
-                <w:sz w:val="22"/>
-                <w:szCs w:val="22"/>
-                <w:lang w:eastAsia="zh-CN"/>
-              </w:rPr>
-              <w:t>.2</w:t>
-            </w:r>
-            <w:r>
-              <w:rPr>
-                <w:rFonts w:asciiTheme="minorHAnsi" w:eastAsia="等线" w:hAnsiTheme="minorHAnsi" w:cs="Calibri" w:hint="eastAsia"/>
-                <w:spacing w:val="-2"/>
-                <w:sz w:val="22"/>
-                <w:szCs w:val="22"/>
-                <w:lang w:eastAsia="zh-CN"/>
-              </w:rPr>
-              <w:t>}}</w:t>
+              <w:t>{{v.II.2.2}}</w:t>
             </w:r>
           </w:p>
         </w:tc>
@@ -16035,7 +15274,7 @@
               <w:spacing w:before="54" w:after="66"/>
               <w:jc w:val="center"/>
               <w:rPr>
-                <w:rFonts w:asciiTheme="minorHAnsi" w:hAnsiTheme="minorHAnsi" w:cs="Calibri"/>
+                <w:rFonts w:asciiTheme="minorHAnsi" w:hAnsiTheme="minorHAnsi" w:cs="Calibri" w:hint="eastAsia"/>
                 <w:spacing w:val="-2"/>
                 <w:sz w:val="22"/>
                 <w:szCs w:val="22"/>
@@ -16044,33 +15283,13 @@
             </w:pPr>
             <w:r>
               <w:rPr>
-                <w:rFonts w:asciiTheme="minorHAnsi" w:eastAsia="等线" w:hAnsiTheme="minorHAnsi" w:cs="Calibri" w:hint="eastAsia"/>
+                <w:rFonts w:asciiTheme="minorHAnsi" w:hAnsiTheme="minorHAnsi" w:cs="Calibri" w:hint="eastAsia"/>
                 <w:spacing w:val="-2"/>
                 <w:sz w:val="22"/>
                 <w:szCs w:val="22"/>
                 <w:lang w:eastAsia="zh-CN"/>
               </w:rPr>
-              <w:t>{{v.II.2</w:t>
-            </w:r>
-            <w:r>
-              <w:rPr>
-                <w:rFonts w:asciiTheme="minorHAnsi" w:eastAsia="等线" w:hAnsiTheme="minorHAnsi" w:cs="Calibri" w:hint="eastAsia"/>
-                <w:spacing w:val="-2"/>
-                <w:sz w:val="22"/>
-                <w:szCs w:val="22"/>
-                <w:lang w:eastAsia="zh-CN"/>
-              </w:rPr>
-              <w:t>.3</w:t>
-            </w:r>
-            <w:r>
-              <w:rPr>
-                <w:rFonts w:asciiTheme="minorHAnsi" w:eastAsia="等线" w:hAnsiTheme="minorHAnsi" w:cs="Calibri" w:hint="eastAsia"/>
-                <w:spacing w:val="-2"/>
-                <w:sz w:val="22"/>
-                <w:szCs w:val="22"/>
-                <w:lang w:eastAsia="zh-CN"/>
-              </w:rPr>
-              <w:t>}}</w:t>
+              <w:t>{{v.II.2.3}}</w:t>
             </w:r>
           </w:p>
         </w:tc>
@@ -16264,7 +15483,7 @@
               <w:spacing w:before="54" w:after="66"/>
               <w:jc w:val="center"/>
               <w:rPr>
-                <w:rFonts w:asciiTheme="minorHAnsi" w:hAnsiTheme="minorHAnsi" w:cs="Calibri"/>
+                <w:rFonts w:asciiTheme="minorHAnsi" w:hAnsiTheme="minorHAnsi" w:cs="Calibri" w:hint="eastAsia"/>
                 <w:spacing w:val="-2"/>
                 <w:sz w:val="22"/>
                 <w:szCs w:val="22"/>
@@ -16273,33 +15492,13 @@
             </w:pPr>
             <w:r>
               <w:rPr>
-                <w:rFonts w:asciiTheme="minorHAnsi" w:eastAsia="等线" w:hAnsiTheme="minorHAnsi" w:cs="Calibri" w:hint="eastAsia"/>
+                <w:rFonts w:asciiTheme="minorHAnsi" w:hAnsiTheme="minorHAnsi" w:cs="Calibri" w:hint="eastAsia"/>
                 <w:spacing w:val="-2"/>
                 <w:sz w:val="22"/>
                 <w:szCs w:val="22"/>
                 <w:lang w:eastAsia="zh-CN"/>
               </w:rPr>
-              <w:t>{{v.II.2</w:t>
-            </w:r>
-            <w:r>
-              <w:rPr>
-                <w:rFonts w:asciiTheme="minorHAnsi" w:eastAsia="等线" w:hAnsiTheme="minorHAnsi" w:cs="Calibri" w:hint="eastAsia"/>
-                <w:spacing w:val="-2"/>
-                <w:sz w:val="22"/>
-                <w:szCs w:val="22"/>
-                <w:lang w:eastAsia="zh-CN"/>
-              </w:rPr>
-              <w:t>.4</w:t>
-            </w:r>
-            <w:r>
-              <w:rPr>
-                <w:rFonts w:asciiTheme="minorHAnsi" w:eastAsia="等线" w:hAnsiTheme="minorHAnsi" w:cs="Calibri" w:hint="eastAsia"/>
-                <w:spacing w:val="-2"/>
-                <w:sz w:val="22"/>
-                <w:szCs w:val="22"/>
-                <w:lang w:eastAsia="zh-CN"/>
-              </w:rPr>
-              <w:t>}}</w:t>
+              <w:t>{{v.II.2.4}}</w:t>
             </w:r>
           </w:p>
         </w:tc>
@@ -16456,33 +15655,13 @@
             </w:pPr>
             <w:r>
               <w:rPr>
-                <w:rFonts w:asciiTheme="minorHAnsi" w:eastAsia="等线" w:hAnsiTheme="minorHAnsi" w:cs="Calibri" w:hint="eastAsia"/>
+                <w:rFonts w:asciiTheme="minorHAnsi" w:hAnsiTheme="minorHAnsi" w:cs="Calibri"/>
                 <w:spacing w:val="-2"/>
                 <w:sz w:val="22"/>
                 <w:szCs w:val="22"/>
                 <w:lang w:eastAsia="zh-CN"/>
               </w:rPr>
-              <w:t>{{v.II.2</w:t>
-            </w:r>
-            <w:r>
-              <w:rPr>
-                <w:rFonts w:asciiTheme="minorHAnsi" w:eastAsia="等线" w:hAnsiTheme="minorHAnsi" w:cs="Calibri" w:hint="eastAsia"/>
-                <w:spacing w:val="-2"/>
-                <w:sz w:val="22"/>
-                <w:szCs w:val="22"/>
-                <w:lang w:eastAsia="zh-CN"/>
-              </w:rPr>
-              <w:t>.5</w:t>
-            </w:r>
-            <w:r>
-              <w:rPr>
-                <w:rFonts w:asciiTheme="minorHAnsi" w:eastAsia="等线" w:hAnsiTheme="minorHAnsi" w:cs="Calibri" w:hint="eastAsia"/>
-                <w:spacing w:val="-2"/>
-                <w:sz w:val="22"/>
-                <w:szCs w:val="22"/>
-                <w:lang w:eastAsia="zh-CN"/>
-              </w:rPr>
-              <w:t>}}</w:t>
+              <w:t>{{v.II.2.5}}</w:t>
             </w:r>
           </w:p>
         </w:tc>
@@ -16702,33 +15881,13 @@
             </w:pPr>
             <w:r>
               <w:rPr>
-                <w:rFonts w:asciiTheme="minorHAnsi" w:eastAsia="等线" w:hAnsiTheme="minorHAnsi" w:cs="Calibri" w:hint="eastAsia"/>
+                <w:rFonts w:asciiTheme="minorHAnsi" w:hAnsiTheme="minorHAnsi" w:cs="Calibri"/>
                 <w:spacing w:val="-2"/>
                 <w:sz w:val="22"/>
                 <w:szCs w:val="22"/>
                 <w:lang w:eastAsia="zh-CN"/>
               </w:rPr>
-              <w:t>{{v.II.2</w:t>
-            </w:r>
-            <w:r>
-              <w:rPr>
-                <w:rFonts w:asciiTheme="minorHAnsi" w:eastAsia="等线" w:hAnsiTheme="minorHAnsi" w:cs="Calibri" w:hint="eastAsia"/>
-                <w:spacing w:val="-2"/>
-                <w:sz w:val="22"/>
-                <w:szCs w:val="22"/>
-                <w:lang w:eastAsia="zh-CN"/>
-              </w:rPr>
-              <w:t>.6</w:t>
-            </w:r>
-            <w:r>
-              <w:rPr>
-                <w:rFonts w:asciiTheme="minorHAnsi" w:eastAsia="等线" w:hAnsiTheme="minorHAnsi" w:cs="Calibri" w:hint="eastAsia"/>
-                <w:spacing w:val="-2"/>
-                <w:sz w:val="22"/>
-                <w:szCs w:val="22"/>
-                <w:lang w:eastAsia="zh-CN"/>
-              </w:rPr>
-              <w:t>}}</w:t>
+              <w:t>{{v.II.2.6}}</w:t>
             </w:r>
           </w:p>
         </w:tc>
@@ -16883,33 +16042,13 @@
             </w:pPr>
             <w:r>
               <w:rPr>
-                <w:rFonts w:asciiTheme="minorHAnsi" w:eastAsia="等线" w:hAnsiTheme="minorHAnsi" w:cs="Calibri" w:hint="eastAsia"/>
+                <w:rFonts w:asciiTheme="minorHAnsi" w:eastAsia="等线" w:hAnsiTheme="minorHAnsi" w:cs="Calibri"/>
                 <w:spacing w:val="-2"/>
                 <w:sz w:val="22"/>
                 <w:szCs w:val="22"/>
                 <w:lang w:eastAsia="zh-CN"/>
               </w:rPr>
-              <w:t>{{v.II.2</w:t>
-            </w:r>
-            <w:r>
-              <w:rPr>
-                <w:rFonts w:asciiTheme="minorHAnsi" w:eastAsia="等线" w:hAnsiTheme="minorHAnsi" w:cs="Calibri" w:hint="eastAsia"/>
-                <w:spacing w:val="-2"/>
-                <w:sz w:val="22"/>
-                <w:szCs w:val="22"/>
-                <w:lang w:eastAsia="zh-CN"/>
-              </w:rPr>
-              <w:t>.7</w:t>
-            </w:r>
-            <w:r>
-              <w:rPr>
-                <w:rFonts w:asciiTheme="minorHAnsi" w:eastAsia="等线" w:hAnsiTheme="minorHAnsi" w:cs="Calibri" w:hint="eastAsia"/>
-                <w:spacing w:val="-2"/>
-                <w:sz w:val="22"/>
-                <w:szCs w:val="22"/>
-                <w:lang w:eastAsia="zh-CN"/>
-              </w:rPr>
-              <w:t>}}</w:t>
+              <w:t>{{v.II.2.7}}</w:t>
             </w:r>
           </w:p>
         </w:tc>
@@ -17056,33 +16195,13 @@
             </w:pPr>
             <w:r>
               <w:rPr>
-                <w:rFonts w:asciiTheme="minorHAnsi" w:eastAsia="等线" w:hAnsiTheme="minorHAnsi" w:cs="Calibri" w:hint="eastAsia"/>
+                <w:rFonts w:asciiTheme="minorHAnsi" w:hAnsiTheme="minorHAnsi" w:cs="Calibri"/>
                 <w:spacing w:val="-2"/>
                 <w:sz w:val="22"/>
                 <w:szCs w:val="22"/>
                 <w:lang w:eastAsia="zh-CN"/>
               </w:rPr>
-              <w:t>{{v.II.2</w:t>
-            </w:r>
-            <w:r>
-              <w:rPr>
-                <w:rFonts w:asciiTheme="minorHAnsi" w:eastAsia="等线" w:hAnsiTheme="minorHAnsi" w:cs="Calibri" w:hint="eastAsia"/>
-                <w:spacing w:val="-2"/>
-                <w:sz w:val="22"/>
-                <w:szCs w:val="22"/>
-                <w:lang w:eastAsia="zh-CN"/>
-              </w:rPr>
-              <w:t>.8</w:t>
-            </w:r>
-            <w:r>
-              <w:rPr>
-                <w:rFonts w:asciiTheme="minorHAnsi" w:eastAsia="等线" w:hAnsiTheme="minorHAnsi" w:cs="Calibri" w:hint="eastAsia"/>
-                <w:spacing w:val="-2"/>
-                <w:sz w:val="22"/>
-                <w:szCs w:val="22"/>
-                <w:lang w:eastAsia="zh-CN"/>
-              </w:rPr>
-              <w:t>}}</w:t>
+              <w:t>{{v.II.2.8}}</w:t>
             </w:r>
           </w:p>
         </w:tc>
@@ -17229,33 +16348,13 @@
             </w:pPr>
             <w:r>
               <w:rPr>
-                <w:rFonts w:asciiTheme="minorHAnsi" w:eastAsia="等线" w:hAnsiTheme="minorHAnsi" w:cs="Calibri" w:hint="eastAsia"/>
+                <w:rFonts w:asciiTheme="minorHAnsi" w:eastAsia="等线" w:hAnsiTheme="minorHAnsi" w:cs="Calibri"/>
                 <w:spacing w:val="-2"/>
                 <w:sz w:val="22"/>
                 <w:szCs w:val="22"/>
                 <w:lang w:eastAsia="zh-CN"/>
               </w:rPr>
-              <w:t>{{v.II.2</w:t>
-            </w:r>
-            <w:r>
-              <w:rPr>
-                <w:rFonts w:asciiTheme="minorHAnsi" w:eastAsia="等线" w:hAnsiTheme="minorHAnsi" w:cs="Calibri" w:hint="eastAsia"/>
-                <w:spacing w:val="-2"/>
-                <w:sz w:val="22"/>
-                <w:szCs w:val="22"/>
-                <w:lang w:eastAsia="zh-CN"/>
-              </w:rPr>
-              <w:t>.9</w:t>
-            </w:r>
-            <w:r>
-              <w:rPr>
-                <w:rFonts w:asciiTheme="minorHAnsi" w:eastAsia="等线" w:hAnsiTheme="minorHAnsi" w:cs="Calibri" w:hint="eastAsia"/>
-                <w:spacing w:val="-2"/>
-                <w:sz w:val="22"/>
-                <w:szCs w:val="22"/>
-                <w:lang w:eastAsia="zh-CN"/>
-              </w:rPr>
-              <w:t>}}</w:t>
+              <w:t>{{v.II.2.9}}</w:t>
             </w:r>
           </w:p>
         </w:tc>
@@ -17629,33 +16728,13 @@
             </w:pPr>
             <w:r>
               <w:rPr>
-                <w:rFonts w:asciiTheme="minorHAnsi" w:eastAsia="等线" w:hAnsiTheme="minorHAnsi" w:cs="Calibri" w:hint="eastAsia"/>
+                <w:rFonts w:asciiTheme="minorHAnsi" w:eastAsia="等线" w:hAnsiTheme="minorHAnsi" w:cs="Calibri"/>
                 <w:spacing w:val="-2"/>
                 <w:sz w:val="22"/>
                 <w:szCs w:val="22"/>
                 <w:lang w:eastAsia="zh-CN"/>
               </w:rPr>
-              <w:t>{{v.II.</w:t>
-            </w:r>
-            <w:r>
-              <w:rPr>
-                <w:rFonts w:asciiTheme="minorHAnsi" w:eastAsia="等线" w:hAnsiTheme="minorHAnsi" w:cs="Calibri" w:hint="eastAsia"/>
-                <w:spacing w:val="-2"/>
-                <w:sz w:val="22"/>
-                <w:szCs w:val="22"/>
-                <w:lang w:eastAsia="zh-CN"/>
-              </w:rPr>
-              <w:t>3.a</w:t>
-            </w:r>
-            <w:r>
-              <w:rPr>
-                <w:rFonts w:asciiTheme="minorHAnsi" w:eastAsia="等线" w:hAnsiTheme="minorHAnsi" w:cs="Calibri" w:hint="eastAsia"/>
-                <w:spacing w:val="-2"/>
-                <w:sz w:val="22"/>
-                <w:szCs w:val="22"/>
-                <w:lang w:eastAsia="zh-CN"/>
-              </w:rPr>
-              <w:t>}}</w:t>
+              <w:t>{{v.II.3.a}}</w:t>
             </w:r>
           </w:p>
         </w:tc>
@@ -17778,33 +16857,13 @@
             </w:pPr>
             <w:r>
               <w:rPr>
-                <w:rFonts w:asciiTheme="minorHAnsi" w:eastAsia="等线" w:hAnsiTheme="minorHAnsi" w:cs="Calibri" w:hint="eastAsia"/>
+                <w:rFonts w:asciiTheme="minorHAnsi" w:eastAsia="等线" w:hAnsiTheme="minorHAnsi" w:cs="Calibri"/>
                 <w:spacing w:val="-2"/>
                 <w:sz w:val="22"/>
                 <w:szCs w:val="22"/>
                 <w:lang w:eastAsia="zh-CN"/>
               </w:rPr>
-              <w:t>{{v.II.3.a</w:t>
-            </w:r>
-            <w:r>
-              <w:rPr>
-                <w:rFonts w:asciiTheme="minorHAnsi" w:eastAsia="等线" w:hAnsiTheme="minorHAnsi" w:cs="Calibri" w:hint="eastAsia"/>
-                <w:spacing w:val="-2"/>
-                <w:sz w:val="22"/>
-                <w:szCs w:val="22"/>
-                <w:lang w:eastAsia="zh-CN"/>
-              </w:rPr>
-              <w:t>.1</w:t>
-            </w:r>
-            <w:r>
-              <w:rPr>
-                <w:rFonts w:asciiTheme="minorHAnsi" w:eastAsia="等线" w:hAnsiTheme="minorHAnsi" w:cs="Calibri" w:hint="eastAsia"/>
-                <w:spacing w:val="-2"/>
-                <w:sz w:val="22"/>
-                <w:szCs w:val="22"/>
-                <w:lang w:eastAsia="zh-CN"/>
-              </w:rPr>
-              <w:t>}}</w:t>
+              <w:t>{{v.II.3.a.1}}</w:t>
             </w:r>
           </w:p>
         </w:tc>
@@ -17929,33 +16988,13 @@
             </w:pPr>
             <w:r>
               <w:rPr>
-                <w:rFonts w:asciiTheme="minorHAnsi" w:eastAsia="等线" w:hAnsiTheme="minorHAnsi" w:cs="Calibri" w:hint="eastAsia"/>
+                <w:rFonts w:asciiTheme="minorHAnsi" w:eastAsia="等线" w:hAnsiTheme="minorHAnsi" w:cs="Calibri"/>
                 <w:spacing w:val="-2"/>
                 <w:sz w:val="22"/>
                 <w:szCs w:val="22"/>
                 <w:lang w:eastAsia="zh-CN"/>
               </w:rPr>
-              <w:t>{{v.II.3.a</w:t>
-            </w:r>
-            <w:r>
-              <w:rPr>
-                <w:rFonts w:asciiTheme="minorHAnsi" w:eastAsia="等线" w:hAnsiTheme="minorHAnsi" w:cs="Calibri" w:hint="eastAsia"/>
-                <w:spacing w:val="-2"/>
-                <w:sz w:val="22"/>
-                <w:szCs w:val="22"/>
-                <w:lang w:eastAsia="zh-CN"/>
-              </w:rPr>
-              <w:t>.2</w:t>
-            </w:r>
-            <w:r>
-              <w:rPr>
-                <w:rFonts w:asciiTheme="minorHAnsi" w:eastAsia="等线" w:hAnsiTheme="minorHAnsi" w:cs="Calibri" w:hint="eastAsia"/>
-                <w:spacing w:val="-2"/>
-                <w:sz w:val="22"/>
-                <w:szCs w:val="22"/>
-                <w:lang w:eastAsia="zh-CN"/>
-              </w:rPr>
-              <w:t>}}</w:t>
+              <w:t>{{v.II.3.a.2}}</w:t>
             </w:r>
           </w:p>
         </w:tc>
@@ -18070,33 +17109,13 @@
             </w:pPr>
             <w:r>
               <w:rPr>
-                <w:rFonts w:asciiTheme="minorHAnsi" w:eastAsia="等线" w:hAnsiTheme="minorHAnsi" w:cs="Calibri" w:hint="eastAsia"/>
+                <w:rFonts w:asciiTheme="minorHAnsi" w:eastAsia="等线" w:hAnsiTheme="minorHAnsi" w:cs="Calibri"/>
                 <w:spacing w:val="-2"/>
                 <w:sz w:val="22"/>
                 <w:szCs w:val="22"/>
                 <w:lang w:eastAsia="zh-CN"/>
               </w:rPr>
-              <w:t>{{v.II.3.a</w:t>
-            </w:r>
-            <w:r>
-              <w:rPr>
-                <w:rFonts w:asciiTheme="minorHAnsi" w:eastAsia="等线" w:hAnsiTheme="minorHAnsi" w:cs="Calibri" w:hint="eastAsia"/>
-                <w:spacing w:val="-2"/>
-                <w:sz w:val="22"/>
-                <w:szCs w:val="22"/>
-                <w:lang w:eastAsia="zh-CN"/>
-              </w:rPr>
-              <w:t>.3</w:t>
-            </w:r>
-            <w:r>
-              <w:rPr>
-                <w:rFonts w:asciiTheme="minorHAnsi" w:eastAsia="等线" w:hAnsiTheme="minorHAnsi" w:cs="Calibri" w:hint="eastAsia"/>
-                <w:spacing w:val="-2"/>
-                <w:sz w:val="22"/>
-                <w:szCs w:val="22"/>
-                <w:lang w:eastAsia="zh-CN"/>
-              </w:rPr>
-              <w:t>}}</w:t>
+              <w:t>{{v.II.3.a.3}}</w:t>
             </w:r>
           </w:p>
         </w:tc>
@@ -18201,33 +17220,13 @@
             </w:pPr>
             <w:r>
               <w:rPr>
-                <w:rFonts w:asciiTheme="minorHAnsi" w:eastAsia="等线" w:hAnsiTheme="minorHAnsi" w:cs="Calibri" w:hint="eastAsia"/>
+                <w:rFonts w:asciiTheme="minorHAnsi" w:eastAsia="等线" w:hAnsiTheme="minorHAnsi" w:cs="Calibri"/>
                 <w:spacing w:val="-2"/>
                 <w:sz w:val="22"/>
                 <w:szCs w:val="22"/>
                 <w:lang w:eastAsia="zh-CN"/>
               </w:rPr>
-              <w:t>{{v.II.3.</w:t>
-            </w:r>
-            <w:r>
-              <w:rPr>
-                <w:rFonts w:asciiTheme="minorHAnsi" w:eastAsia="等线" w:hAnsiTheme="minorHAnsi" w:cs="Calibri" w:hint="eastAsia"/>
-                <w:spacing w:val="-2"/>
-                <w:sz w:val="22"/>
-                <w:szCs w:val="22"/>
-                <w:lang w:eastAsia="zh-CN"/>
-              </w:rPr>
-              <w:t>b</w:t>
-            </w:r>
-            <w:r>
-              <w:rPr>
-                <w:rFonts w:asciiTheme="minorHAnsi" w:eastAsia="等线" w:hAnsiTheme="minorHAnsi" w:cs="Calibri" w:hint="eastAsia"/>
-                <w:spacing w:val="-2"/>
-                <w:sz w:val="22"/>
-                <w:szCs w:val="22"/>
-                <w:lang w:eastAsia="zh-CN"/>
-              </w:rPr>
-              <w:t>}}</w:t>
+              <w:t>{{v.II.3.b}}</w:t>
             </w:r>
           </w:p>
         </w:tc>
@@ -18330,33 +17329,13 @@
             </w:pPr>
             <w:r>
               <w:rPr>
-                <w:rFonts w:asciiTheme="minorHAnsi" w:eastAsia="等线" w:hAnsiTheme="minorHAnsi" w:cs="Calibri" w:hint="eastAsia"/>
+                <w:rFonts w:asciiTheme="minorHAnsi" w:eastAsia="等线" w:hAnsiTheme="minorHAnsi" w:cs="Calibri"/>
                 <w:spacing w:val="-2"/>
                 <w:sz w:val="22"/>
                 <w:szCs w:val="22"/>
                 <w:lang w:eastAsia="zh-CN"/>
               </w:rPr>
-              <w:t>{{v.II.3.</w:t>
-            </w:r>
-            <w:r>
-              <w:rPr>
-                <w:rFonts w:asciiTheme="minorHAnsi" w:eastAsia="等线" w:hAnsiTheme="minorHAnsi" w:cs="Calibri" w:hint="eastAsia"/>
-                <w:spacing w:val="-2"/>
-                <w:sz w:val="22"/>
-                <w:szCs w:val="22"/>
-                <w:lang w:eastAsia="zh-CN"/>
-              </w:rPr>
-              <w:t>b.1</w:t>
-            </w:r>
-            <w:r>
-              <w:rPr>
-                <w:rFonts w:asciiTheme="minorHAnsi" w:eastAsia="等线" w:hAnsiTheme="minorHAnsi" w:cs="Calibri" w:hint="eastAsia"/>
-                <w:spacing w:val="-2"/>
-                <w:sz w:val="22"/>
-                <w:szCs w:val="22"/>
-                <w:lang w:eastAsia="zh-CN"/>
-              </w:rPr>
-              <w:t>}}</w:t>
+              <w:t>{{v.II.3.b.1}}</w:t>
             </w:r>
           </w:p>
         </w:tc>
@@ -18541,33 +17520,13 @@
             </w:pPr>
             <w:r>
               <w:rPr>
-                <w:rFonts w:asciiTheme="minorHAnsi" w:eastAsia="等线" w:hAnsiTheme="minorHAnsi" w:cs="Calibri" w:hint="eastAsia"/>
+                <w:rFonts w:asciiTheme="minorHAnsi" w:eastAsia="等线" w:hAnsiTheme="minorHAnsi" w:cs="Calibri"/>
                 <w:spacing w:val="-2"/>
                 <w:sz w:val="22"/>
                 <w:szCs w:val="22"/>
                 <w:lang w:eastAsia="zh-CN"/>
               </w:rPr>
-              <w:t>{{v.II.3.b.1</w:t>
-            </w:r>
-            <w:r>
-              <w:rPr>
-                <w:rFonts w:asciiTheme="minorHAnsi" w:eastAsia="等线" w:hAnsiTheme="minorHAnsi" w:cs="Calibri" w:hint="eastAsia"/>
-                <w:spacing w:val="-2"/>
-                <w:sz w:val="22"/>
-                <w:szCs w:val="22"/>
-                <w:lang w:eastAsia="zh-CN"/>
-              </w:rPr>
-              <w:t>.1</w:t>
-            </w:r>
-            <w:r>
-              <w:rPr>
-                <w:rFonts w:asciiTheme="minorHAnsi" w:eastAsia="等线" w:hAnsiTheme="minorHAnsi" w:cs="Calibri" w:hint="eastAsia"/>
-                <w:spacing w:val="-2"/>
-                <w:sz w:val="22"/>
-                <w:szCs w:val="22"/>
-                <w:lang w:eastAsia="zh-CN"/>
-              </w:rPr>
-              <w:t>}}</w:t>
+              <w:t>{{v.II.3.b.1.1}}</w:t>
             </w:r>
           </w:p>
         </w:tc>
@@ -18647,7 +17606,7 @@
               <w:spacing w:before="66" w:after="54" w:line="240" w:lineRule="exact"/>
               <w:jc w:val="center"/>
               <w:rPr>
-                <w:rFonts w:ascii="Calibri" w:hAnsi="Calibri" w:cs="Calibri"/>
+                <w:rFonts w:ascii="Calibri" w:hAnsi="Calibri" w:cs="Calibri" w:hint="eastAsia"/>
                 <w:spacing w:val="-2"/>
                 <w:sz w:val="22"/>
                 <w:szCs w:val="22"/>
@@ -18683,33 +17642,13 @@
             </w:pPr>
             <w:r>
               <w:rPr>
-                <w:rFonts w:asciiTheme="minorHAnsi" w:eastAsia="等线" w:hAnsiTheme="minorHAnsi" w:cs="Calibri" w:hint="eastAsia"/>
+                <w:rFonts w:asciiTheme="minorHAnsi" w:eastAsia="等线" w:hAnsiTheme="minorHAnsi" w:cs="Calibri"/>
                 <w:spacing w:val="-2"/>
                 <w:sz w:val="22"/>
                 <w:szCs w:val="22"/>
                 <w:lang w:eastAsia="zh-CN"/>
               </w:rPr>
-              <w:t>{{v.II.3.b.1</w:t>
-            </w:r>
-            <w:r>
-              <w:rPr>
-                <w:rFonts w:asciiTheme="minorHAnsi" w:eastAsia="等线" w:hAnsiTheme="minorHAnsi" w:cs="Calibri" w:hint="eastAsia"/>
-                <w:spacing w:val="-2"/>
-                <w:sz w:val="22"/>
-                <w:szCs w:val="22"/>
-                <w:lang w:eastAsia="zh-CN"/>
-              </w:rPr>
-              <w:t>.2</w:t>
-            </w:r>
-            <w:r>
-              <w:rPr>
-                <w:rFonts w:asciiTheme="minorHAnsi" w:eastAsia="等线" w:hAnsiTheme="minorHAnsi" w:cs="Calibri" w:hint="eastAsia"/>
-                <w:spacing w:val="-2"/>
-                <w:sz w:val="22"/>
-                <w:szCs w:val="22"/>
-                <w:lang w:eastAsia="zh-CN"/>
-              </w:rPr>
-              <w:t>}}</w:t>
+              <w:t>{{v.II.3.b.1.2}}</w:t>
             </w:r>
           </w:p>
         </w:tc>
@@ -18825,33 +17764,13 @@
             </w:pPr>
             <w:r>
               <w:rPr>
-                <w:rFonts w:asciiTheme="minorHAnsi" w:eastAsia="等线" w:hAnsiTheme="minorHAnsi" w:cs="Calibri" w:hint="eastAsia"/>
+                <w:rFonts w:asciiTheme="minorHAnsi" w:eastAsia="等线" w:hAnsiTheme="minorHAnsi" w:cs="Calibri"/>
                 <w:spacing w:val="-2"/>
                 <w:sz w:val="22"/>
                 <w:szCs w:val="22"/>
                 <w:lang w:eastAsia="zh-CN"/>
               </w:rPr>
-              <w:t>{{v.II.3.b.1</w:t>
-            </w:r>
-            <w:r>
-              <w:rPr>
-                <w:rFonts w:asciiTheme="minorHAnsi" w:eastAsia="等线" w:hAnsiTheme="minorHAnsi" w:cs="Calibri" w:hint="eastAsia"/>
-                <w:spacing w:val="-2"/>
-                <w:sz w:val="22"/>
-                <w:szCs w:val="22"/>
-                <w:lang w:eastAsia="zh-CN"/>
-              </w:rPr>
-              <w:t>.3</w:t>
-            </w:r>
-            <w:r>
-              <w:rPr>
-                <w:rFonts w:asciiTheme="minorHAnsi" w:eastAsia="等线" w:hAnsiTheme="minorHAnsi" w:cs="Calibri" w:hint="eastAsia"/>
-                <w:spacing w:val="-2"/>
-                <w:sz w:val="22"/>
-                <w:szCs w:val="22"/>
-                <w:lang w:eastAsia="zh-CN"/>
-              </w:rPr>
-              <w:t>}}</w:t>
+              <w:t>{{v.II.3.b.1.3}}</w:t>
             </w:r>
           </w:p>
         </w:tc>
@@ -18975,33 +17894,13 @@
             </w:pPr>
             <w:r>
               <w:rPr>
-                <w:rFonts w:asciiTheme="minorHAnsi" w:eastAsia="等线" w:hAnsiTheme="minorHAnsi" w:cs="Calibri" w:hint="eastAsia"/>
+                <w:rFonts w:asciiTheme="minorHAnsi" w:eastAsia="等线" w:hAnsiTheme="minorHAnsi" w:cs="Calibri"/>
                 <w:spacing w:val="-2"/>
                 <w:sz w:val="22"/>
                 <w:szCs w:val="22"/>
                 <w:lang w:eastAsia="zh-CN"/>
               </w:rPr>
-              <w:t>{{v.II.3.b.1</w:t>
-            </w:r>
-            <w:r>
-              <w:rPr>
-                <w:rFonts w:asciiTheme="minorHAnsi" w:eastAsia="等线" w:hAnsiTheme="minorHAnsi" w:cs="Calibri" w:hint="eastAsia"/>
-                <w:spacing w:val="-2"/>
-                <w:sz w:val="22"/>
-                <w:szCs w:val="22"/>
-                <w:lang w:eastAsia="zh-CN"/>
-              </w:rPr>
-              <w:t>.4</w:t>
-            </w:r>
-            <w:r>
-              <w:rPr>
-                <w:rFonts w:asciiTheme="minorHAnsi" w:eastAsia="等线" w:hAnsiTheme="minorHAnsi" w:cs="Calibri" w:hint="eastAsia"/>
-                <w:spacing w:val="-2"/>
-                <w:sz w:val="22"/>
-                <w:szCs w:val="22"/>
-                <w:lang w:eastAsia="zh-CN"/>
-              </w:rPr>
-              <w:t>}}</w:t>
+              <w:t>{{v.II.3.b.1.4}}</w:t>
             </w:r>
           </w:p>
         </w:tc>
@@ -19151,33 +18050,13 @@
             </w:pPr>
             <w:r>
               <w:rPr>
-                <w:rFonts w:asciiTheme="minorHAnsi" w:eastAsia="等线" w:hAnsiTheme="minorHAnsi" w:cs="Calibri" w:hint="eastAsia"/>
+                <w:rFonts w:asciiTheme="minorHAnsi" w:eastAsia="等线" w:hAnsiTheme="minorHAnsi" w:cs="Calibri"/>
                 <w:spacing w:val="-2"/>
                 <w:sz w:val="22"/>
                 <w:szCs w:val="22"/>
                 <w:lang w:eastAsia="zh-CN"/>
               </w:rPr>
-              <w:t>{{v.II.3.b.1</w:t>
-            </w:r>
-            <w:r>
-              <w:rPr>
-                <w:rFonts w:asciiTheme="minorHAnsi" w:eastAsia="等线" w:hAnsiTheme="minorHAnsi" w:cs="Calibri" w:hint="eastAsia"/>
-                <w:spacing w:val="-2"/>
-                <w:sz w:val="22"/>
-                <w:szCs w:val="22"/>
-                <w:lang w:eastAsia="zh-CN"/>
-              </w:rPr>
-              <w:t>.5</w:t>
-            </w:r>
-            <w:r>
-              <w:rPr>
-                <w:rFonts w:asciiTheme="minorHAnsi" w:eastAsia="等线" w:hAnsiTheme="minorHAnsi" w:cs="Calibri" w:hint="eastAsia"/>
-                <w:spacing w:val="-2"/>
-                <w:sz w:val="22"/>
-                <w:szCs w:val="22"/>
-                <w:lang w:eastAsia="zh-CN"/>
-              </w:rPr>
-              <w:t>}}</w:t>
+              <w:t>{{v.II.3.b.1.5}}</w:t>
             </w:r>
           </w:p>
         </w:tc>
@@ -19318,33 +18197,13 @@
             </w:pPr>
             <w:r>
               <w:rPr>
-                <w:rFonts w:asciiTheme="minorHAnsi" w:eastAsia="等线" w:hAnsiTheme="minorHAnsi" w:cs="Calibri" w:hint="eastAsia"/>
+                <w:rFonts w:asciiTheme="minorHAnsi" w:eastAsia="等线" w:hAnsiTheme="minorHAnsi" w:cs="Calibri"/>
                 <w:spacing w:val="-2"/>
                 <w:sz w:val="22"/>
                 <w:szCs w:val="22"/>
                 <w:lang w:eastAsia="zh-CN"/>
               </w:rPr>
-              <w:t>{{v.II.3.b.1</w:t>
-            </w:r>
-            <w:r>
-              <w:rPr>
-                <w:rFonts w:asciiTheme="minorHAnsi" w:eastAsia="等线" w:hAnsiTheme="minorHAnsi" w:cs="Calibri" w:hint="eastAsia"/>
-                <w:spacing w:val="-2"/>
-                <w:sz w:val="22"/>
-                <w:szCs w:val="22"/>
-                <w:lang w:eastAsia="zh-CN"/>
-              </w:rPr>
-              <w:t>.6</w:t>
-            </w:r>
-            <w:r>
-              <w:rPr>
-                <w:rFonts w:asciiTheme="minorHAnsi" w:eastAsia="等线" w:hAnsiTheme="minorHAnsi" w:cs="Calibri" w:hint="eastAsia"/>
-                <w:spacing w:val="-2"/>
-                <w:sz w:val="22"/>
-                <w:szCs w:val="22"/>
-                <w:lang w:eastAsia="zh-CN"/>
-              </w:rPr>
-              <w:t>}}</w:t>
+              <w:t>{{v.II.3.b.1.6}}</w:t>
             </w:r>
           </w:p>
         </w:tc>
@@ -19504,33 +18363,13 @@
             </w:pPr>
             <w:r>
               <w:rPr>
-                <w:rFonts w:asciiTheme="minorHAnsi" w:eastAsia="等线" w:hAnsiTheme="minorHAnsi" w:cs="Calibri" w:hint="eastAsia"/>
+                <w:rFonts w:ascii="Calibri" w:hAnsi="Calibri" w:cs="Calibri"/>
                 <w:spacing w:val="-2"/>
                 <w:sz w:val="22"/>
                 <w:szCs w:val="22"/>
                 <w:lang w:eastAsia="zh-CN"/>
               </w:rPr>
-              <w:t>{{v.II.3.b.1</w:t>
-            </w:r>
-            <w:r>
-              <w:rPr>
-                <w:rFonts w:asciiTheme="minorHAnsi" w:eastAsia="等线" w:hAnsiTheme="minorHAnsi" w:cs="Calibri" w:hint="eastAsia"/>
-                <w:spacing w:val="-2"/>
-                <w:sz w:val="22"/>
-                <w:szCs w:val="22"/>
-                <w:lang w:eastAsia="zh-CN"/>
-              </w:rPr>
-              <w:t>.7</w:t>
-            </w:r>
-            <w:r>
-              <w:rPr>
-                <w:rFonts w:asciiTheme="minorHAnsi" w:eastAsia="等线" w:hAnsiTheme="minorHAnsi" w:cs="Calibri" w:hint="eastAsia"/>
-                <w:spacing w:val="-2"/>
-                <w:sz w:val="22"/>
-                <w:szCs w:val="22"/>
-                <w:lang w:eastAsia="zh-CN"/>
-              </w:rPr>
-              <w:t>}}</w:t>
+              <w:t>{{v.II.3.b.1.7}}</w:t>
             </w:r>
           </w:p>
         </w:tc>
@@ -19682,33 +18521,13 @@
             </w:pPr>
             <w:r>
               <w:rPr>
-                <w:rFonts w:asciiTheme="minorHAnsi" w:eastAsia="等线" w:hAnsiTheme="minorHAnsi" w:cs="Calibri" w:hint="eastAsia"/>
+                <w:rFonts w:asciiTheme="minorHAnsi" w:eastAsia="等线" w:hAnsiTheme="minorHAnsi" w:cs="Calibri"/>
                 <w:spacing w:val="-2"/>
                 <w:sz w:val="22"/>
                 <w:szCs w:val="22"/>
                 <w:lang w:eastAsia="zh-CN"/>
               </w:rPr>
-              <w:t>{{v.II.3.b.1</w:t>
-            </w:r>
-            <w:r>
-              <w:rPr>
-                <w:rFonts w:asciiTheme="minorHAnsi" w:eastAsia="等线" w:hAnsiTheme="minorHAnsi" w:cs="Calibri" w:hint="eastAsia"/>
-                <w:spacing w:val="-2"/>
-                <w:sz w:val="22"/>
-                <w:szCs w:val="22"/>
-                <w:lang w:eastAsia="zh-CN"/>
-              </w:rPr>
-              <w:t>.8</w:t>
-            </w:r>
-            <w:r>
-              <w:rPr>
-                <w:rFonts w:asciiTheme="minorHAnsi" w:eastAsia="等线" w:hAnsiTheme="minorHAnsi" w:cs="Calibri" w:hint="eastAsia"/>
-                <w:spacing w:val="-2"/>
-                <w:sz w:val="22"/>
-                <w:szCs w:val="22"/>
-                <w:lang w:eastAsia="zh-CN"/>
-              </w:rPr>
-              <w:t>}}</w:t>
+              <w:t>{{v.II.3.b.1.8}}</w:t>
             </w:r>
           </w:p>
         </w:tc>
@@ -19832,33 +18651,13 @@
             </w:pPr>
             <w:r>
               <w:rPr>
-                <w:rFonts w:asciiTheme="minorHAnsi" w:eastAsia="等线" w:hAnsiTheme="minorHAnsi" w:cs="Calibri" w:hint="eastAsia"/>
+                <w:rFonts w:asciiTheme="minorHAnsi" w:eastAsia="等线" w:hAnsiTheme="minorHAnsi" w:cs="Calibri"/>
                 <w:spacing w:val="-2"/>
                 <w:sz w:val="22"/>
                 <w:szCs w:val="22"/>
                 <w:lang w:eastAsia="zh-CN"/>
               </w:rPr>
-              <w:t>{{v.II.3.b.1</w:t>
-            </w:r>
-            <w:r>
-              <w:rPr>
-                <w:rFonts w:asciiTheme="minorHAnsi" w:eastAsia="等线" w:hAnsiTheme="minorHAnsi" w:cs="Calibri" w:hint="eastAsia"/>
-                <w:spacing w:val="-2"/>
-                <w:sz w:val="22"/>
-                <w:szCs w:val="22"/>
-                <w:lang w:eastAsia="zh-CN"/>
-              </w:rPr>
-              <w:t>.9</w:t>
-            </w:r>
-            <w:r>
-              <w:rPr>
-                <w:rFonts w:asciiTheme="minorHAnsi" w:eastAsia="等线" w:hAnsiTheme="minorHAnsi" w:cs="Calibri" w:hint="eastAsia"/>
-                <w:spacing w:val="-2"/>
-                <w:sz w:val="22"/>
-                <w:szCs w:val="22"/>
-                <w:lang w:eastAsia="zh-CN"/>
-              </w:rPr>
-              <w:t>}}</w:t>
+              <w:t>{{v.II.3.b.1.9}}</w:t>
             </w:r>
           </w:p>
         </w:tc>
@@ -19993,33 +18792,13 @@
             </w:pPr>
             <w:r>
               <w:rPr>
-                <w:rFonts w:asciiTheme="minorHAnsi" w:eastAsia="等线" w:hAnsiTheme="minorHAnsi" w:cs="Calibri" w:hint="eastAsia"/>
+                <w:rFonts w:asciiTheme="minorHAnsi" w:eastAsia="等线" w:hAnsiTheme="minorHAnsi" w:cs="Calibri"/>
                 <w:spacing w:val="-2"/>
                 <w:sz w:val="22"/>
                 <w:szCs w:val="22"/>
                 <w:lang w:eastAsia="zh-CN"/>
               </w:rPr>
-              <w:t>{{v.II.3.b.1</w:t>
-            </w:r>
-            <w:r>
-              <w:rPr>
-                <w:rFonts w:asciiTheme="minorHAnsi" w:eastAsia="等线" w:hAnsiTheme="minorHAnsi" w:cs="Calibri" w:hint="eastAsia"/>
-                <w:spacing w:val="-2"/>
-                <w:sz w:val="22"/>
-                <w:szCs w:val="22"/>
-                <w:lang w:eastAsia="zh-CN"/>
-              </w:rPr>
-              <w:t>.10</w:t>
-            </w:r>
-            <w:r>
-              <w:rPr>
-                <w:rFonts w:asciiTheme="minorHAnsi" w:eastAsia="等线" w:hAnsiTheme="minorHAnsi" w:cs="Calibri" w:hint="eastAsia"/>
-                <w:spacing w:val="-2"/>
-                <w:sz w:val="22"/>
-                <w:szCs w:val="22"/>
-                <w:lang w:eastAsia="zh-CN"/>
-              </w:rPr>
-              <w:t>}}</w:t>
+              <w:t>{{v.II.3.b.1.10}}</w:t>
             </w:r>
           </w:p>
         </w:tc>
@@ -20234,33 +19013,13 @@
             </w:pPr>
             <w:r>
               <w:rPr>
-                <w:rFonts w:asciiTheme="minorHAnsi" w:eastAsia="等线" w:hAnsiTheme="minorHAnsi" w:cs="Calibri" w:hint="eastAsia"/>
+                <w:rFonts w:asciiTheme="minorHAnsi" w:eastAsia="等线" w:hAnsiTheme="minorHAnsi" w:cs="Calibri"/>
                 <w:spacing w:val="-2"/>
                 <w:sz w:val="22"/>
                 <w:szCs w:val="22"/>
                 <w:lang w:eastAsia="zh-CN"/>
               </w:rPr>
-              <w:t>{{v.II.3.b.1</w:t>
-            </w:r>
-            <w:r>
-              <w:rPr>
-                <w:rFonts w:asciiTheme="minorHAnsi" w:eastAsia="等线" w:hAnsiTheme="minorHAnsi" w:cs="Calibri" w:hint="eastAsia"/>
-                <w:spacing w:val="-2"/>
-                <w:sz w:val="22"/>
-                <w:szCs w:val="22"/>
-                <w:lang w:eastAsia="zh-CN"/>
-              </w:rPr>
-              <w:t>.11</w:t>
-            </w:r>
-            <w:r>
-              <w:rPr>
-                <w:rFonts w:asciiTheme="minorHAnsi" w:eastAsia="等线" w:hAnsiTheme="minorHAnsi" w:cs="Calibri" w:hint="eastAsia"/>
-                <w:spacing w:val="-2"/>
-                <w:sz w:val="22"/>
-                <w:szCs w:val="22"/>
-                <w:lang w:eastAsia="zh-CN"/>
-              </w:rPr>
-              <w:t>}}</w:t>
+              <w:t>{{v.II.3.b.1.11}}</w:t>
             </w:r>
           </w:p>
         </w:tc>
@@ -20377,33 +19136,13 @@
             </w:pPr>
             <w:r>
               <w:rPr>
-                <w:rFonts w:asciiTheme="minorHAnsi" w:eastAsia="等线" w:hAnsiTheme="minorHAnsi" w:cs="Calibri" w:hint="eastAsia"/>
+                <w:rFonts w:asciiTheme="minorHAnsi" w:eastAsia="等线" w:hAnsiTheme="minorHAnsi" w:cs="Calibri"/>
                 <w:spacing w:val="-2"/>
                 <w:sz w:val="22"/>
                 <w:szCs w:val="22"/>
                 <w:lang w:eastAsia="zh-CN"/>
               </w:rPr>
-              <w:t>{{v.II.3.b.1</w:t>
-            </w:r>
-            <w:r>
-              <w:rPr>
-                <w:rFonts w:asciiTheme="minorHAnsi" w:eastAsia="等线" w:hAnsiTheme="minorHAnsi" w:cs="Calibri" w:hint="eastAsia"/>
-                <w:spacing w:val="-2"/>
-                <w:sz w:val="22"/>
-                <w:szCs w:val="22"/>
-                <w:lang w:eastAsia="zh-CN"/>
-              </w:rPr>
-              <w:t>.12</w:t>
-            </w:r>
-            <w:r>
-              <w:rPr>
-                <w:rFonts w:asciiTheme="minorHAnsi" w:eastAsia="等线" w:hAnsiTheme="minorHAnsi" w:cs="Calibri" w:hint="eastAsia"/>
-                <w:spacing w:val="-2"/>
-                <w:sz w:val="22"/>
-                <w:szCs w:val="22"/>
-                <w:lang w:eastAsia="zh-CN"/>
-              </w:rPr>
-              <w:t>}}</w:t>
+              <w:t>{{v.II.3.b.1.12}}</w:t>
             </w:r>
           </w:p>
         </w:tc>
@@ -20520,33 +19259,13 @@
             </w:pPr>
             <w:r>
               <w:rPr>
-                <w:rFonts w:asciiTheme="minorHAnsi" w:eastAsia="等线" w:hAnsiTheme="minorHAnsi" w:cs="Calibri" w:hint="eastAsia"/>
+                <w:rFonts w:asciiTheme="minorHAnsi" w:eastAsia="等线" w:hAnsiTheme="minorHAnsi" w:cs="Calibri"/>
                 <w:spacing w:val="-2"/>
                 <w:sz w:val="22"/>
                 <w:szCs w:val="22"/>
                 <w:lang w:eastAsia="zh-CN"/>
               </w:rPr>
-              <w:t>{{v.II.3.b.1</w:t>
-            </w:r>
-            <w:r>
-              <w:rPr>
-                <w:rFonts w:asciiTheme="minorHAnsi" w:eastAsia="等线" w:hAnsiTheme="minorHAnsi" w:cs="Calibri" w:hint="eastAsia"/>
-                <w:spacing w:val="-2"/>
-                <w:sz w:val="22"/>
-                <w:szCs w:val="22"/>
-                <w:lang w:eastAsia="zh-CN"/>
-              </w:rPr>
-              <w:t>.13</w:t>
-            </w:r>
-            <w:r>
-              <w:rPr>
-                <w:rFonts w:asciiTheme="minorHAnsi" w:eastAsia="等线" w:hAnsiTheme="minorHAnsi" w:cs="Calibri" w:hint="eastAsia"/>
-                <w:spacing w:val="-2"/>
-                <w:sz w:val="22"/>
-                <w:szCs w:val="22"/>
-                <w:lang w:eastAsia="zh-CN"/>
-              </w:rPr>
-              <w:t>}}</w:t>
+              <w:t>{{v.II.3.b.1.13}}</w:t>
             </w:r>
           </w:p>
         </w:tc>
@@ -20663,33 +19382,13 @@
             </w:pPr>
             <w:r>
               <w:rPr>
-                <w:rFonts w:asciiTheme="minorHAnsi" w:eastAsia="等线" w:hAnsiTheme="minorHAnsi" w:cs="Calibri" w:hint="eastAsia"/>
+                <w:rFonts w:asciiTheme="minorHAnsi" w:hAnsiTheme="minorHAnsi" w:cs="Calibri"/>
                 <w:spacing w:val="-2"/>
                 <w:sz w:val="22"/>
                 <w:szCs w:val="22"/>
                 <w:lang w:eastAsia="zh-CN"/>
               </w:rPr>
-              <w:t>{{v.II.3.b.1</w:t>
-            </w:r>
-            <w:r>
-              <w:rPr>
-                <w:rFonts w:asciiTheme="minorHAnsi" w:eastAsia="等线" w:hAnsiTheme="minorHAnsi" w:cs="Calibri" w:hint="eastAsia"/>
-                <w:spacing w:val="-2"/>
-                <w:sz w:val="22"/>
-                <w:szCs w:val="22"/>
-                <w:lang w:eastAsia="zh-CN"/>
-              </w:rPr>
-              <w:t>.14</w:t>
-            </w:r>
-            <w:r>
-              <w:rPr>
-                <w:rFonts w:asciiTheme="minorHAnsi" w:eastAsia="等线" w:hAnsiTheme="minorHAnsi" w:cs="Calibri" w:hint="eastAsia"/>
-                <w:spacing w:val="-2"/>
-                <w:sz w:val="22"/>
-                <w:szCs w:val="22"/>
-                <w:lang w:eastAsia="zh-CN"/>
-              </w:rPr>
-              <w:t>}}</w:t>
+              <w:t>{{v.II.3.b.1.14}}</w:t>
             </w:r>
           </w:p>
         </w:tc>
@@ -20823,33 +19522,13 @@
             </w:pPr>
             <w:r>
               <w:rPr>
-                <w:rFonts w:asciiTheme="minorHAnsi" w:eastAsia="等线" w:hAnsiTheme="minorHAnsi" w:cs="Calibri" w:hint="eastAsia"/>
+                <w:rFonts w:asciiTheme="minorHAnsi" w:hAnsiTheme="minorHAnsi" w:cs="Calibri"/>
                 <w:spacing w:val="-2"/>
                 <w:sz w:val="22"/>
                 <w:szCs w:val="22"/>
                 <w:lang w:eastAsia="zh-CN"/>
               </w:rPr>
-              <w:t>{{v.II.3.b.1</w:t>
-            </w:r>
-            <w:r>
-              <w:rPr>
-                <w:rFonts w:asciiTheme="minorHAnsi" w:eastAsia="等线" w:hAnsiTheme="minorHAnsi" w:cs="Calibri" w:hint="eastAsia"/>
-                <w:spacing w:val="-2"/>
-                <w:sz w:val="22"/>
-                <w:szCs w:val="22"/>
-                <w:lang w:eastAsia="zh-CN"/>
-              </w:rPr>
-              <w:t>.15</w:t>
-            </w:r>
-            <w:r>
-              <w:rPr>
-                <w:rFonts w:asciiTheme="minorHAnsi" w:eastAsia="等线" w:hAnsiTheme="minorHAnsi" w:cs="Calibri" w:hint="eastAsia"/>
-                <w:spacing w:val="-2"/>
-                <w:sz w:val="22"/>
-                <w:szCs w:val="22"/>
-                <w:lang w:eastAsia="zh-CN"/>
-              </w:rPr>
-              <w:t>}}</w:t>
+              <w:t>{{v.II.3.b.1.15}}</w:t>
             </w:r>
           </w:p>
         </w:tc>
@@ -20966,33 +19645,13 @@
             </w:pPr>
             <w:r>
               <w:rPr>
-                <w:rFonts w:asciiTheme="minorHAnsi" w:eastAsia="等线" w:hAnsiTheme="minorHAnsi" w:cs="Calibri" w:hint="eastAsia"/>
+                <w:rFonts w:asciiTheme="minorHAnsi" w:hAnsiTheme="minorHAnsi" w:cs="Calibri"/>
                 <w:spacing w:val="-2"/>
                 <w:sz w:val="22"/>
                 <w:szCs w:val="22"/>
                 <w:lang w:eastAsia="zh-CN"/>
               </w:rPr>
-              <w:t>{{v.II.3.b.1</w:t>
-            </w:r>
-            <w:r>
-              <w:rPr>
-                <w:rFonts w:asciiTheme="minorHAnsi" w:eastAsia="等线" w:hAnsiTheme="minorHAnsi" w:cs="Calibri" w:hint="eastAsia"/>
-                <w:spacing w:val="-2"/>
-                <w:sz w:val="22"/>
-                <w:szCs w:val="22"/>
-                <w:lang w:eastAsia="zh-CN"/>
-              </w:rPr>
-              <w:t>.16</w:t>
-            </w:r>
-            <w:r>
-              <w:rPr>
-                <w:rFonts w:asciiTheme="minorHAnsi" w:eastAsia="等线" w:hAnsiTheme="minorHAnsi" w:cs="Calibri" w:hint="eastAsia"/>
-                <w:spacing w:val="-2"/>
-                <w:sz w:val="22"/>
-                <w:szCs w:val="22"/>
-                <w:lang w:eastAsia="zh-CN"/>
-              </w:rPr>
-              <w:t>}}</w:t>
+              <w:t>{{v.II.3.b.1.16}}</w:t>
             </w:r>
           </w:p>
         </w:tc>
@@ -21109,33 +19768,13 @@
             </w:pPr>
             <w:r>
               <w:rPr>
-                <w:rFonts w:asciiTheme="minorHAnsi" w:eastAsia="等线" w:hAnsiTheme="minorHAnsi" w:cs="Calibri" w:hint="eastAsia"/>
+                <w:rFonts w:asciiTheme="minorHAnsi" w:eastAsia="等线" w:hAnsiTheme="minorHAnsi" w:cs="Calibri"/>
                 <w:spacing w:val="-2"/>
                 <w:sz w:val="22"/>
                 <w:szCs w:val="22"/>
                 <w:lang w:eastAsia="zh-CN"/>
               </w:rPr>
-              <w:t>{{v.II.3.b.1</w:t>
-            </w:r>
-            <w:r>
-              <w:rPr>
-                <w:rFonts w:asciiTheme="minorHAnsi" w:eastAsia="等线" w:hAnsiTheme="minorHAnsi" w:cs="Calibri" w:hint="eastAsia"/>
-                <w:spacing w:val="-2"/>
-                <w:sz w:val="22"/>
-                <w:szCs w:val="22"/>
-                <w:lang w:eastAsia="zh-CN"/>
-              </w:rPr>
-              <w:t>.17</w:t>
-            </w:r>
-            <w:r>
-              <w:rPr>
-                <w:rFonts w:asciiTheme="minorHAnsi" w:eastAsia="等线" w:hAnsiTheme="minorHAnsi" w:cs="Calibri" w:hint="eastAsia"/>
-                <w:spacing w:val="-2"/>
-                <w:sz w:val="22"/>
-                <w:szCs w:val="22"/>
-                <w:lang w:eastAsia="zh-CN"/>
-              </w:rPr>
-              <w:t>}}</w:t>
+              <w:t>{{v.II.3.b.1.17}}</w:t>
             </w:r>
           </w:p>
         </w:tc>
@@ -21252,33 +19891,13 @@
             </w:pPr>
             <w:r>
               <w:rPr>
-                <w:rFonts w:asciiTheme="minorHAnsi" w:eastAsia="等线" w:hAnsiTheme="minorHAnsi" w:cs="Calibri" w:hint="eastAsia"/>
+                <w:rFonts w:asciiTheme="minorHAnsi" w:eastAsia="等线" w:hAnsiTheme="minorHAnsi" w:cs="Calibri"/>
                 <w:spacing w:val="-2"/>
                 <w:sz w:val="22"/>
                 <w:szCs w:val="22"/>
                 <w:lang w:eastAsia="zh-CN"/>
               </w:rPr>
-              <w:t>{{v.II.3.b.1</w:t>
-            </w:r>
-            <w:r>
-              <w:rPr>
-                <w:rFonts w:asciiTheme="minorHAnsi" w:eastAsia="等线" w:hAnsiTheme="minorHAnsi" w:cs="Calibri" w:hint="eastAsia"/>
-                <w:spacing w:val="-2"/>
-                <w:sz w:val="22"/>
-                <w:szCs w:val="22"/>
-                <w:lang w:eastAsia="zh-CN"/>
-              </w:rPr>
-              <w:t>.18</w:t>
-            </w:r>
-            <w:r>
-              <w:rPr>
-                <w:rFonts w:asciiTheme="minorHAnsi" w:eastAsia="等线" w:hAnsiTheme="minorHAnsi" w:cs="Calibri" w:hint="eastAsia"/>
-                <w:spacing w:val="-2"/>
-                <w:sz w:val="22"/>
-                <w:szCs w:val="22"/>
-                <w:lang w:eastAsia="zh-CN"/>
-              </w:rPr>
-              <w:t>}}</w:t>
+              <w:t>{{v.II.3.b.1.18}}</w:t>
             </w:r>
           </w:p>
         </w:tc>
@@ -21409,33 +20028,13 @@
             </w:pPr>
             <w:r>
               <w:rPr>
-                <w:rFonts w:asciiTheme="minorHAnsi" w:eastAsia="等线" w:hAnsiTheme="minorHAnsi" w:cs="Calibri" w:hint="eastAsia"/>
+                <w:rFonts w:asciiTheme="minorHAnsi" w:eastAsia="等线" w:hAnsiTheme="minorHAnsi" w:cs="Calibri"/>
                 <w:spacing w:val="-2"/>
                 <w:sz w:val="22"/>
                 <w:szCs w:val="22"/>
                 <w:lang w:eastAsia="zh-CN"/>
               </w:rPr>
-              <w:t>{{v.II.3.b.</w:t>
-            </w:r>
-            <w:r>
-              <w:rPr>
-                <w:rFonts w:asciiTheme="minorHAnsi" w:eastAsia="等线" w:hAnsiTheme="minorHAnsi" w:cs="Calibri" w:hint="eastAsia"/>
-                <w:spacing w:val="-2"/>
-                <w:sz w:val="22"/>
-                <w:szCs w:val="22"/>
-                <w:lang w:eastAsia="zh-CN"/>
-              </w:rPr>
-              <w:t>2</w:t>
-            </w:r>
-            <w:r>
-              <w:rPr>
-                <w:rFonts w:asciiTheme="minorHAnsi" w:eastAsia="等线" w:hAnsiTheme="minorHAnsi" w:cs="Calibri" w:hint="eastAsia"/>
-                <w:spacing w:val="-2"/>
-                <w:sz w:val="22"/>
-                <w:szCs w:val="22"/>
-                <w:lang w:eastAsia="zh-CN"/>
-              </w:rPr>
-              <w:t>}}</w:t>
+              <w:t>{{v.II.3.b.2}}</w:t>
             </w:r>
           </w:p>
         </w:tc>
@@ -21552,33 +20151,13 @@
             </w:pPr>
             <w:r>
               <w:rPr>
-                <w:rFonts w:asciiTheme="minorHAnsi" w:eastAsia="等线" w:hAnsiTheme="minorHAnsi" w:cs="Calibri" w:hint="eastAsia"/>
+                <w:rFonts w:asciiTheme="minorHAnsi" w:eastAsia="等线" w:hAnsiTheme="minorHAnsi" w:cs="Calibri"/>
                 <w:spacing w:val="-2"/>
                 <w:sz w:val="22"/>
                 <w:szCs w:val="22"/>
                 <w:lang w:eastAsia="zh-CN"/>
               </w:rPr>
-              <w:t>{{v.II.3.b.2</w:t>
-            </w:r>
-            <w:r>
-              <w:rPr>
-                <w:rFonts w:asciiTheme="minorHAnsi" w:eastAsia="等线" w:hAnsiTheme="minorHAnsi" w:cs="Calibri" w:hint="eastAsia"/>
-                <w:spacing w:val="-2"/>
-                <w:sz w:val="22"/>
-                <w:szCs w:val="22"/>
-                <w:lang w:eastAsia="zh-CN"/>
-              </w:rPr>
-              <w:t>.1</w:t>
-            </w:r>
-            <w:r>
-              <w:rPr>
-                <w:rFonts w:asciiTheme="minorHAnsi" w:eastAsia="等线" w:hAnsiTheme="minorHAnsi" w:cs="Calibri" w:hint="eastAsia"/>
-                <w:spacing w:val="-2"/>
-                <w:sz w:val="22"/>
-                <w:szCs w:val="22"/>
-                <w:lang w:eastAsia="zh-CN"/>
-              </w:rPr>
-              <w:t>}}</w:t>
+              <w:t>{{v.II.3.b.2.1}}</w:t>
             </w:r>
           </w:p>
         </w:tc>
@@ -21673,30 +20252,12 @@
             </w:pPr>
             <w:r>
               <w:rPr>
-                <w:rFonts w:ascii="Calibri" w:eastAsia="Arial Unicode MS" w:hAnsi="Calibri" w:cs="Calibri" w:hint="eastAsia"/>
-                <w:sz w:val="22"/>
-                <w:szCs w:val="22"/>
-                <w:lang w:eastAsia="zh-CN"/>
-              </w:rPr>
-              <w:t>{{light_</w:t>
-            </w:r>
-            <w:r>
-              <w:rPr>
-                <w:rFonts w:ascii="Calibri" w:eastAsia="Arial Unicode MS" w:hAnsi="Calibri" w:cs="Calibri" w:hint="eastAsia"/>
-                <w:sz w:val="22"/>
-                <w:szCs w:val="22"/>
-                <w:lang w:eastAsia="zh-CN"/>
-              </w:rPr>
-              <w:t>source_tech</w:t>
-            </w:r>
-            <w:r>
-              <w:rPr>
-                <w:rFonts w:ascii="Calibri" w:eastAsia="Arial Unicode MS" w:hAnsi="Calibri" w:cs="Calibri" w:hint="eastAsia"/>
-                <w:sz w:val="22"/>
-                <w:szCs w:val="22"/>
-                <w:lang w:eastAsia="zh-CN"/>
-              </w:rPr>
-              <w:t>}}</w:t>
+                <w:rFonts w:ascii="Calibri" w:eastAsia="Arial Unicode MS" w:hAnsi="Calibri" w:cs="Calibri"/>
+                <w:sz w:val="22"/>
+                <w:szCs w:val="22"/>
+                <w:lang w:eastAsia="zh-CN"/>
+              </w:rPr>
+              <w:t>{{light_source_tech}}</w:t>
             </w:r>
           </w:p>
         </w:tc>
@@ -21721,33 +20282,13 @@
             </w:pPr>
             <w:r>
               <w:rPr>
-                <w:rFonts w:asciiTheme="minorHAnsi" w:eastAsia="等线" w:hAnsiTheme="minorHAnsi" w:cs="Calibri" w:hint="eastAsia"/>
+                <w:rFonts w:asciiTheme="minorHAnsi" w:eastAsia="等线" w:hAnsiTheme="minorHAnsi" w:cs="Calibri"/>
                 <w:spacing w:val="-2"/>
                 <w:sz w:val="22"/>
                 <w:szCs w:val="22"/>
                 <w:lang w:eastAsia="zh-CN"/>
               </w:rPr>
-              <w:t>{{v.II.3.b.2</w:t>
-            </w:r>
-            <w:r>
-              <w:rPr>
-                <w:rFonts w:asciiTheme="minorHAnsi" w:eastAsia="等线" w:hAnsiTheme="minorHAnsi" w:cs="Calibri" w:hint="eastAsia"/>
-                <w:spacing w:val="-2"/>
-                <w:sz w:val="22"/>
-                <w:szCs w:val="22"/>
-                <w:lang w:eastAsia="zh-CN"/>
-              </w:rPr>
-              <w:t>.2</w:t>
-            </w:r>
-            <w:r>
-              <w:rPr>
-                <w:rFonts w:asciiTheme="minorHAnsi" w:eastAsia="等线" w:hAnsiTheme="minorHAnsi" w:cs="Calibri" w:hint="eastAsia"/>
-                <w:spacing w:val="-2"/>
-                <w:sz w:val="22"/>
-                <w:szCs w:val="22"/>
-                <w:lang w:eastAsia="zh-CN"/>
-              </w:rPr>
-              <w:t>}}</w:t>
+              <w:t>{{v.II.3.b.2.2}}</w:t>
             </w:r>
           </w:p>
         </w:tc>
@@ -21864,33 +20405,13 @@
             </w:pPr>
             <w:r>
               <w:rPr>
-                <w:rFonts w:asciiTheme="minorHAnsi" w:eastAsia="等线" w:hAnsiTheme="minorHAnsi" w:cs="Calibri" w:hint="eastAsia"/>
+                <w:rFonts w:asciiTheme="minorHAnsi" w:eastAsia="等线" w:hAnsiTheme="minorHAnsi" w:cs="Calibri"/>
                 <w:spacing w:val="-2"/>
                 <w:sz w:val="22"/>
                 <w:szCs w:val="22"/>
                 <w:lang w:eastAsia="zh-CN"/>
               </w:rPr>
-              <w:t>{{v.II.3.b.2</w:t>
-            </w:r>
-            <w:r>
-              <w:rPr>
-                <w:rFonts w:asciiTheme="minorHAnsi" w:eastAsia="等线" w:hAnsiTheme="minorHAnsi" w:cs="Calibri" w:hint="eastAsia"/>
-                <w:spacing w:val="-2"/>
-                <w:sz w:val="22"/>
-                <w:szCs w:val="22"/>
-                <w:lang w:eastAsia="zh-CN"/>
-              </w:rPr>
-              <w:t>.3</w:t>
-            </w:r>
-            <w:r>
-              <w:rPr>
-                <w:rFonts w:asciiTheme="minorHAnsi" w:eastAsia="等线" w:hAnsiTheme="minorHAnsi" w:cs="Calibri" w:hint="eastAsia"/>
-                <w:spacing w:val="-2"/>
-                <w:sz w:val="22"/>
-                <w:szCs w:val="22"/>
-                <w:lang w:eastAsia="zh-CN"/>
-              </w:rPr>
-              <w:t>}}</w:t>
+              <w:t>{{v.II.3.b.2.3}}</w:t>
             </w:r>
           </w:p>
         </w:tc>
@@ -22066,10 +20587,10 @@
         <w:tblLook w:val="04A0" w:firstRow="1" w:lastRow="0" w:firstColumn="1" w:lastColumn="0" w:noHBand="0" w:noVBand="1"/>
       </w:tblPr>
       <w:tblGrid>
-        <w:gridCol w:w="1012"/>
-        <w:gridCol w:w="4814"/>
-        <w:gridCol w:w="2382"/>
-        <w:gridCol w:w="1138"/>
+        <w:gridCol w:w="1002"/>
+        <w:gridCol w:w="4805"/>
+        <w:gridCol w:w="2373"/>
+        <w:gridCol w:w="1166"/>
       </w:tblGrid>
       <w:tr>
         <w:trPr>
@@ -22227,33 +20748,13 @@
             </w:pPr>
             <w:r>
               <w:rPr>
-                <w:rFonts w:asciiTheme="minorHAnsi" w:eastAsia="等线" w:hAnsiTheme="minorHAnsi" w:cs="Calibri" w:hint="eastAsia"/>
+                <w:rFonts w:asciiTheme="minorHAnsi" w:eastAsia="等线" w:hAnsiTheme="minorHAnsi" w:cs="Calibri"/>
                 <w:spacing w:val="-2"/>
                 <w:sz w:val="22"/>
                 <w:szCs w:val="22"/>
                 <w:lang w:eastAsia="zh-CN"/>
               </w:rPr>
-              <w:t>{{v.II.3.b.</w:t>
-            </w:r>
-            <w:r>
-              <w:rPr>
-                <w:rFonts w:asciiTheme="minorHAnsi" w:eastAsia="等线" w:hAnsiTheme="minorHAnsi" w:cs="Calibri" w:hint="eastAsia"/>
-                <w:spacing w:val="-2"/>
-                <w:sz w:val="22"/>
-                <w:szCs w:val="22"/>
-                <w:lang w:eastAsia="zh-CN"/>
-              </w:rPr>
-              <w:t>4</w:t>
-            </w:r>
-            <w:r>
-              <w:rPr>
-                <w:rFonts w:asciiTheme="minorHAnsi" w:eastAsia="等线" w:hAnsiTheme="minorHAnsi" w:cs="Calibri" w:hint="eastAsia"/>
-                <w:spacing w:val="-2"/>
-                <w:sz w:val="22"/>
-                <w:szCs w:val="22"/>
-                <w:lang w:eastAsia="zh-CN"/>
-              </w:rPr>
-              <w:t>}}</w:t>
+              <w:t>{{v.II.3.b.4}}</w:t>
             </w:r>
           </w:p>
         </w:tc>
@@ -22395,33 +20896,13 @@
             </w:pPr>
             <w:r>
               <w:rPr>
-                <w:rFonts w:asciiTheme="minorHAnsi" w:eastAsia="等线" w:hAnsiTheme="minorHAnsi" w:cs="Calibri" w:hint="eastAsia"/>
+                <w:rFonts w:asciiTheme="minorHAnsi" w:eastAsia="等线" w:hAnsiTheme="minorHAnsi" w:cs="Calibri"/>
                 <w:spacing w:val="-2"/>
                 <w:sz w:val="22"/>
                 <w:szCs w:val="22"/>
                 <w:lang w:eastAsia="zh-CN"/>
               </w:rPr>
-              <w:t>{{v.II.3.b.</w:t>
-            </w:r>
-            <w:r>
-              <w:rPr>
-                <w:rFonts w:asciiTheme="minorHAnsi" w:eastAsia="等线" w:hAnsiTheme="minorHAnsi" w:cs="Calibri" w:hint="eastAsia"/>
-                <w:spacing w:val="-2"/>
-                <w:sz w:val="22"/>
-                <w:szCs w:val="22"/>
-                <w:lang w:eastAsia="zh-CN"/>
-              </w:rPr>
-              <w:t>5</w:t>
-            </w:r>
-            <w:r>
-              <w:rPr>
-                <w:rFonts w:asciiTheme="minorHAnsi" w:eastAsia="等线" w:hAnsiTheme="minorHAnsi" w:cs="Calibri" w:hint="eastAsia"/>
-                <w:spacing w:val="-2"/>
-                <w:sz w:val="22"/>
-                <w:szCs w:val="22"/>
-                <w:lang w:eastAsia="zh-CN"/>
-              </w:rPr>
-              <w:t>}}</w:t>
+              <w:t>{{v.II.3.b.5}}</w:t>
             </w:r>
           </w:p>
         </w:tc>
@@ -22563,33 +21044,13 @@
             </w:pPr>
             <w:r>
               <w:rPr>
-                <w:rFonts w:asciiTheme="minorHAnsi" w:eastAsia="等线" w:hAnsiTheme="minorHAnsi" w:cs="Calibri" w:hint="eastAsia"/>
+                <w:rFonts w:asciiTheme="minorHAnsi" w:eastAsia="等线" w:hAnsiTheme="minorHAnsi" w:cs="Calibri"/>
                 <w:spacing w:val="-2"/>
                 <w:sz w:val="22"/>
                 <w:szCs w:val="22"/>
                 <w:lang w:eastAsia="zh-CN"/>
               </w:rPr>
-              <w:t>{{v.II.3.b.</w:t>
-            </w:r>
-            <w:r>
-              <w:rPr>
-                <w:rFonts w:asciiTheme="minorHAnsi" w:eastAsia="等线" w:hAnsiTheme="minorHAnsi" w:cs="Calibri" w:hint="eastAsia"/>
-                <w:spacing w:val="-2"/>
-                <w:sz w:val="22"/>
-                <w:szCs w:val="22"/>
-                <w:lang w:eastAsia="zh-CN"/>
-              </w:rPr>
-              <w:t>6</w:t>
-            </w:r>
-            <w:r>
-              <w:rPr>
-                <w:rFonts w:asciiTheme="minorHAnsi" w:eastAsia="等线" w:hAnsiTheme="minorHAnsi" w:cs="Calibri" w:hint="eastAsia"/>
-                <w:spacing w:val="-2"/>
-                <w:sz w:val="22"/>
-                <w:szCs w:val="22"/>
-                <w:lang w:eastAsia="zh-CN"/>
-              </w:rPr>
-              <w:t>}}</w:t>
+              <w:t>{{v.II.3.b.6}}</w:t>
             </w:r>
           </w:p>
         </w:tc>
@@ -22722,33 +21183,13 @@
             </w:pPr>
             <w:r>
               <w:rPr>
-                <w:rFonts w:asciiTheme="minorHAnsi" w:eastAsia="等线" w:hAnsiTheme="minorHAnsi" w:cs="Calibri" w:hint="eastAsia"/>
+                <w:rFonts w:asciiTheme="minorHAnsi" w:eastAsia="等线" w:hAnsiTheme="minorHAnsi" w:cs="Calibri"/>
                 <w:spacing w:val="-2"/>
                 <w:sz w:val="22"/>
                 <w:szCs w:val="22"/>
                 <w:lang w:eastAsia="zh-CN"/>
               </w:rPr>
-              <w:t>{{v.II.3.b.</w:t>
-            </w:r>
-            <w:r>
-              <w:rPr>
-                <w:rFonts w:asciiTheme="minorHAnsi" w:eastAsia="等线" w:hAnsiTheme="minorHAnsi" w:cs="Calibri" w:hint="eastAsia"/>
-                <w:spacing w:val="-2"/>
-                <w:sz w:val="22"/>
-                <w:szCs w:val="22"/>
-                <w:lang w:eastAsia="zh-CN"/>
-              </w:rPr>
-              <w:t>7</w:t>
-            </w:r>
-            <w:r>
-              <w:rPr>
-                <w:rFonts w:asciiTheme="minorHAnsi" w:eastAsia="等线" w:hAnsiTheme="minorHAnsi" w:cs="Calibri" w:hint="eastAsia"/>
-                <w:spacing w:val="-2"/>
-                <w:sz w:val="22"/>
-                <w:szCs w:val="22"/>
-                <w:lang w:eastAsia="zh-CN"/>
-              </w:rPr>
-              <w:t>}}</w:t>
+              <w:t>{{v.II.3.b.7}}</w:t>
             </w:r>
           </w:p>
         </w:tc>
@@ -22853,33 +21294,11 @@
             </w:pPr>
             <w:r>
               <w:rPr>
-                <w:rFonts w:asciiTheme="minorHAnsi" w:eastAsia="等线" w:hAnsiTheme="minorHAnsi" w:cs="Calibri" w:hint="eastAsia"/>
-                <w:spacing w:val="-2"/>
-                <w:sz w:val="22"/>
-                <w:szCs w:val="22"/>
-                <w:lang w:eastAsia="zh-CN"/>
-              </w:rPr>
-              <w:t>{{v.II.3.b.</w:t>
-            </w:r>
-            <w:r>
-              <w:rPr>
-                <w:rFonts w:asciiTheme="minorHAnsi" w:eastAsia="等线" w:hAnsiTheme="minorHAnsi" w:cs="Calibri" w:hint="eastAsia"/>
-                <w:spacing w:val="-2"/>
-                <w:sz w:val="22"/>
-                <w:szCs w:val="22"/>
-                <w:lang w:eastAsia="zh-CN"/>
-              </w:rPr>
-              <w:t>8</w:t>
-            </w:r>
-            <w:r>
-              <w:rPr>
-                <w:rFonts w:asciiTheme="minorHAnsi" w:eastAsia="等线" w:hAnsiTheme="minorHAnsi" w:cs="Calibri" w:hint="eastAsia"/>
-                <w:spacing w:val="-2"/>
-                <w:sz w:val="22"/>
-                <w:szCs w:val="22"/>
-                <w:lang w:eastAsia="zh-CN"/>
-              </w:rPr>
-              <w:t>}}</w:t>
+                <w:rFonts w:ascii="Calibri" w:hAnsi="Calibri" w:cs="Calibri"/>
+                <w:sz w:val="22"/>
+                <w:szCs w:val="22"/>
+              </w:rPr>
+              <w:t>{{v.II.3.b.8}}</w:t>
             </w:r>
           </w:p>
         </w:tc>
@@ -23319,33 +21738,13 @@
             </w:pPr>
             <w:r>
               <w:rPr>
-                <w:rFonts w:asciiTheme="minorHAnsi" w:eastAsia="等线" w:hAnsiTheme="minorHAnsi" w:cs="Calibri" w:hint="eastAsia"/>
+                <w:rFonts w:asciiTheme="minorHAnsi" w:eastAsia="等线" w:hAnsiTheme="minorHAnsi" w:cs="Calibri"/>
                 <w:spacing w:val="-2"/>
                 <w:sz w:val="22"/>
                 <w:szCs w:val="22"/>
                 <w:lang w:eastAsia="zh-CN"/>
               </w:rPr>
-              <w:t>{{v.II.3.</w:t>
-            </w:r>
-            <w:r>
-              <w:rPr>
-                <w:rFonts w:asciiTheme="minorHAnsi" w:eastAsia="等线" w:hAnsiTheme="minorHAnsi" w:cs="Calibri" w:hint="eastAsia"/>
-                <w:spacing w:val="-2"/>
-                <w:sz w:val="22"/>
-                <w:szCs w:val="22"/>
-                <w:lang w:eastAsia="zh-CN"/>
-              </w:rPr>
-              <w:t>c</w:t>
-            </w:r>
-            <w:r>
-              <w:rPr>
-                <w:rFonts w:asciiTheme="minorHAnsi" w:eastAsia="等线" w:hAnsiTheme="minorHAnsi" w:cs="Calibri" w:hint="eastAsia"/>
-                <w:spacing w:val="-2"/>
-                <w:sz w:val="22"/>
-                <w:szCs w:val="22"/>
-                <w:lang w:eastAsia="zh-CN"/>
-              </w:rPr>
-              <w:t>}}</w:t>
+              <w:t>{{v.II.3.c}}</w:t>
             </w:r>
           </w:p>
         </w:tc>
@@ -23463,43 +21862,13 @@
             </w:pPr>
             <w:r>
               <w:rPr>
-                <w:rFonts w:asciiTheme="minorHAnsi" w:eastAsia="等线" w:hAnsiTheme="minorHAnsi" w:cs="Calibri" w:hint="eastAsia"/>
+                <w:rFonts w:asciiTheme="minorHAnsi" w:eastAsia="等线" w:hAnsiTheme="minorHAnsi" w:cs="Calibri"/>
                 <w:spacing w:val="-2"/>
                 <w:sz w:val="22"/>
                 <w:szCs w:val="22"/>
                 <w:lang w:eastAsia="zh-CN"/>
               </w:rPr>
-              <w:t>{{v.II.3.</w:t>
-            </w:r>
-            <w:r>
-              <w:rPr>
-                <w:rFonts w:asciiTheme="minorHAnsi" w:eastAsia="等线" w:hAnsiTheme="minorHAnsi" w:cs="Calibri" w:hint="eastAsia"/>
-                <w:spacing w:val="-2"/>
-                <w:sz w:val="22"/>
-                <w:szCs w:val="22"/>
-                <w:lang w:eastAsia="zh-CN"/>
-              </w:rPr>
-              <w:t>c</w:t>
-            </w:r>
-            <w:r>
-              <w:rPr>
-                <w:rFonts w:asciiTheme="minorHAnsi" w:eastAsia="等线" w:hAnsiTheme="minorHAnsi" w:cs="Calibri" w:hint="eastAsia"/>
-                <w:spacing w:val="-2"/>
-                <w:sz w:val="22"/>
-                <w:szCs w:val="22"/>
-                <w:lang w:eastAsia="zh-CN"/>
-              </w:rPr>
-              <w:t>.1</w:t>
-            </w:r>
-            <w:r>
-              <w:rPr>
-                <w:rFonts w:asciiTheme="minorHAnsi" w:eastAsia="等线" w:hAnsiTheme="minorHAnsi" w:cs="Calibri" w:hint="eastAsia"/>
-                <w:spacing w:val="-2"/>
-                <w:sz w:val="22"/>
-                <w:szCs w:val="22"/>
-                <w:lang w:eastAsia="zh-CN"/>
-              </w:rPr>
-              <w:t>}}</w:t>
+              <w:t>{{v.II.3.c.1}}</w:t>
             </w:r>
           </w:p>
         </w:tc>
@@ -23614,43 +21983,13 @@
             </w:pPr>
             <w:r>
               <w:rPr>
-                <w:rFonts w:asciiTheme="minorHAnsi" w:eastAsia="等线" w:hAnsiTheme="minorHAnsi" w:cs="Calibri" w:hint="eastAsia"/>
+                <w:rFonts w:asciiTheme="minorHAnsi" w:eastAsia="等线" w:hAnsiTheme="minorHAnsi" w:cs="Calibri"/>
                 <w:spacing w:val="-2"/>
                 <w:sz w:val="22"/>
                 <w:szCs w:val="22"/>
                 <w:lang w:eastAsia="zh-CN"/>
               </w:rPr>
-              <w:t>{{v.II.3.</w:t>
-            </w:r>
-            <w:r>
-              <w:rPr>
-                <w:rFonts w:asciiTheme="minorHAnsi" w:eastAsia="等线" w:hAnsiTheme="minorHAnsi" w:cs="Calibri" w:hint="eastAsia"/>
-                <w:spacing w:val="-2"/>
-                <w:sz w:val="22"/>
-                <w:szCs w:val="22"/>
-                <w:lang w:eastAsia="zh-CN"/>
-              </w:rPr>
-              <w:t>c</w:t>
-            </w:r>
-            <w:r>
-              <w:rPr>
-                <w:rFonts w:asciiTheme="minorHAnsi" w:eastAsia="等线" w:hAnsiTheme="minorHAnsi" w:cs="Calibri" w:hint="eastAsia"/>
-                <w:spacing w:val="-2"/>
-                <w:sz w:val="22"/>
-                <w:szCs w:val="22"/>
-                <w:lang w:eastAsia="zh-CN"/>
-              </w:rPr>
-              <w:t>.1.1</w:t>
-            </w:r>
-            <w:r>
-              <w:rPr>
-                <w:rFonts w:asciiTheme="minorHAnsi" w:eastAsia="等线" w:hAnsiTheme="minorHAnsi" w:cs="Calibri" w:hint="eastAsia"/>
-                <w:spacing w:val="-2"/>
-                <w:sz w:val="22"/>
-                <w:szCs w:val="22"/>
-                <w:lang w:eastAsia="zh-CN"/>
-              </w:rPr>
-              <w:t>}}</w:t>
+              <w:t>{{v.II.3.c.1.1}}</w:t>
             </w:r>
           </w:p>
         </w:tc>
@@ -23765,43 +22104,13 @@
             </w:pPr>
             <w:r>
               <w:rPr>
-                <w:rFonts w:asciiTheme="minorHAnsi" w:eastAsia="等线" w:hAnsiTheme="minorHAnsi" w:cs="Calibri" w:hint="eastAsia"/>
+                <w:rFonts w:asciiTheme="minorHAnsi" w:eastAsia="等线" w:hAnsiTheme="minorHAnsi" w:cs="Calibri"/>
                 <w:spacing w:val="-2"/>
                 <w:sz w:val="22"/>
                 <w:szCs w:val="22"/>
                 <w:lang w:eastAsia="zh-CN"/>
               </w:rPr>
-              <w:t>{{v.II.3.</w:t>
-            </w:r>
-            <w:r>
-              <w:rPr>
-                <w:rFonts w:asciiTheme="minorHAnsi" w:eastAsia="等线" w:hAnsiTheme="minorHAnsi" w:cs="Calibri" w:hint="eastAsia"/>
-                <w:spacing w:val="-2"/>
-                <w:sz w:val="22"/>
-                <w:szCs w:val="22"/>
-                <w:lang w:eastAsia="zh-CN"/>
-              </w:rPr>
-              <w:t>c</w:t>
-            </w:r>
-            <w:r>
-              <w:rPr>
-                <w:rFonts w:asciiTheme="minorHAnsi" w:eastAsia="等线" w:hAnsiTheme="minorHAnsi" w:cs="Calibri" w:hint="eastAsia"/>
-                <w:spacing w:val="-2"/>
-                <w:sz w:val="22"/>
-                <w:szCs w:val="22"/>
-                <w:lang w:eastAsia="zh-CN"/>
-              </w:rPr>
-              <w:t>.1.2</w:t>
-            </w:r>
-            <w:r>
-              <w:rPr>
-                <w:rFonts w:asciiTheme="minorHAnsi" w:eastAsia="等线" w:hAnsiTheme="minorHAnsi" w:cs="Calibri" w:hint="eastAsia"/>
-                <w:spacing w:val="-2"/>
-                <w:sz w:val="22"/>
-                <w:szCs w:val="22"/>
-                <w:lang w:eastAsia="zh-CN"/>
-              </w:rPr>
-              <w:t>}}</w:t>
+              <w:t>{{v.II.3.c.1.2}}</w:t>
             </w:r>
           </w:p>
         </w:tc>
@@ -23917,43 +22226,13 @@
             </w:pPr>
             <w:r>
               <w:rPr>
-                <w:rFonts w:asciiTheme="minorHAnsi" w:eastAsia="等线" w:hAnsiTheme="minorHAnsi" w:cs="Calibri" w:hint="eastAsia"/>
+                <w:rFonts w:asciiTheme="minorHAnsi" w:eastAsia="等线" w:hAnsiTheme="minorHAnsi" w:cs="Calibri"/>
                 <w:spacing w:val="-2"/>
                 <w:sz w:val="22"/>
                 <w:szCs w:val="22"/>
                 <w:lang w:eastAsia="zh-CN"/>
               </w:rPr>
-              <w:t>{{v.II.3.</w:t>
-            </w:r>
-            <w:r>
-              <w:rPr>
-                <w:rFonts w:asciiTheme="minorHAnsi" w:eastAsia="等线" w:hAnsiTheme="minorHAnsi" w:cs="Calibri" w:hint="eastAsia"/>
-                <w:spacing w:val="-2"/>
-                <w:sz w:val="22"/>
-                <w:szCs w:val="22"/>
-                <w:lang w:eastAsia="zh-CN"/>
-              </w:rPr>
-              <w:t>c</w:t>
-            </w:r>
-            <w:r>
-              <w:rPr>
-                <w:rFonts w:asciiTheme="minorHAnsi" w:eastAsia="等线" w:hAnsiTheme="minorHAnsi" w:cs="Calibri" w:hint="eastAsia"/>
-                <w:spacing w:val="-2"/>
-                <w:sz w:val="22"/>
-                <w:szCs w:val="22"/>
-                <w:lang w:eastAsia="zh-CN"/>
-              </w:rPr>
-              <w:t>.1.3</w:t>
-            </w:r>
-            <w:r>
-              <w:rPr>
-                <w:rFonts w:asciiTheme="minorHAnsi" w:eastAsia="等线" w:hAnsiTheme="minorHAnsi" w:cs="Calibri" w:hint="eastAsia"/>
-                <w:spacing w:val="-2"/>
-                <w:sz w:val="22"/>
-                <w:szCs w:val="22"/>
-                <w:lang w:eastAsia="zh-CN"/>
-              </w:rPr>
-              <w:t>}}</w:t>
+              <w:t>{{v.II.3.c.1.3}}</w:t>
             </w:r>
           </w:p>
         </w:tc>
@@ -24061,43 +22340,13 @@
             </w:pPr>
             <w:r>
               <w:rPr>
-                <w:rFonts w:asciiTheme="minorHAnsi" w:eastAsia="等线" w:hAnsiTheme="minorHAnsi" w:cs="Calibri" w:hint="eastAsia"/>
+                <w:rFonts w:asciiTheme="minorHAnsi" w:eastAsia="等线" w:hAnsiTheme="minorHAnsi" w:cs="Calibri"/>
                 <w:spacing w:val="-2"/>
                 <w:sz w:val="22"/>
                 <w:szCs w:val="22"/>
                 <w:lang w:eastAsia="zh-CN"/>
               </w:rPr>
-              <w:t>{{v.II.3.</w:t>
-            </w:r>
-            <w:r>
-              <w:rPr>
-                <w:rFonts w:asciiTheme="minorHAnsi" w:eastAsia="等线" w:hAnsiTheme="minorHAnsi" w:cs="Calibri" w:hint="eastAsia"/>
-                <w:spacing w:val="-2"/>
-                <w:sz w:val="22"/>
-                <w:szCs w:val="22"/>
-                <w:lang w:eastAsia="zh-CN"/>
-              </w:rPr>
-              <w:t>c</w:t>
-            </w:r>
-            <w:r>
-              <w:rPr>
-                <w:rFonts w:asciiTheme="minorHAnsi" w:eastAsia="等线" w:hAnsiTheme="minorHAnsi" w:cs="Calibri" w:hint="eastAsia"/>
-                <w:spacing w:val="-2"/>
-                <w:sz w:val="22"/>
-                <w:szCs w:val="22"/>
-                <w:lang w:eastAsia="zh-CN"/>
-              </w:rPr>
-              <w:t>.1.4</w:t>
-            </w:r>
-            <w:r>
-              <w:rPr>
-                <w:rFonts w:asciiTheme="minorHAnsi" w:eastAsia="等线" w:hAnsiTheme="minorHAnsi" w:cs="Calibri" w:hint="eastAsia"/>
-                <w:spacing w:val="-2"/>
-                <w:sz w:val="22"/>
-                <w:szCs w:val="22"/>
-                <w:lang w:eastAsia="zh-CN"/>
-              </w:rPr>
-              <w:t>}}</w:t>
+              <w:t>{{v.II.3.c.1.4}}</w:t>
             </w:r>
           </w:p>
         </w:tc>
@@ -24205,43 +22454,13 @@
             </w:pPr>
             <w:r>
               <w:rPr>
-                <w:rFonts w:asciiTheme="minorHAnsi" w:eastAsia="等线" w:hAnsiTheme="minorHAnsi" w:cs="Calibri" w:hint="eastAsia"/>
+                <w:rFonts w:asciiTheme="minorHAnsi" w:eastAsia="等线" w:hAnsiTheme="minorHAnsi" w:cs="Calibri"/>
                 <w:spacing w:val="-2"/>
                 <w:sz w:val="22"/>
                 <w:szCs w:val="22"/>
                 <w:lang w:eastAsia="zh-CN"/>
               </w:rPr>
-              <w:t>{{v.II.3.</w:t>
-            </w:r>
-            <w:r>
-              <w:rPr>
-                <w:rFonts w:asciiTheme="minorHAnsi" w:eastAsia="等线" w:hAnsiTheme="minorHAnsi" w:cs="Calibri" w:hint="eastAsia"/>
-                <w:spacing w:val="-2"/>
-                <w:sz w:val="22"/>
-                <w:szCs w:val="22"/>
-                <w:lang w:eastAsia="zh-CN"/>
-              </w:rPr>
-              <w:t>c</w:t>
-            </w:r>
-            <w:r>
-              <w:rPr>
-                <w:rFonts w:asciiTheme="minorHAnsi" w:eastAsia="等线" w:hAnsiTheme="minorHAnsi" w:cs="Calibri" w:hint="eastAsia"/>
-                <w:spacing w:val="-2"/>
-                <w:sz w:val="22"/>
-                <w:szCs w:val="22"/>
-                <w:lang w:eastAsia="zh-CN"/>
-              </w:rPr>
-              <w:t>.1.5</w:t>
-            </w:r>
-            <w:r>
-              <w:rPr>
-                <w:rFonts w:asciiTheme="minorHAnsi" w:eastAsia="等线" w:hAnsiTheme="minorHAnsi" w:cs="Calibri" w:hint="eastAsia"/>
-                <w:spacing w:val="-2"/>
-                <w:sz w:val="22"/>
-                <w:szCs w:val="22"/>
-                <w:lang w:eastAsia="zh-CN"/>
-              </w:rPr>
-              <w:t>}}</w:t>
+              <w:t>{{v.II.3.c.1.5}}</w:t>
             </w:r>
           </w:p>
         </w:tc>
@@ -24349,43 +22568,13 @@
             </w:pPr>
             <w:r>
               <w:rPr>
-                <w:rFonts w:asciiTheme="minorHAnsi" w:eastAsia="等线" w:hAnsiTheme="minorHAnsi" w:cs="Calibri" w:hint="eastAsia"/>
+                <w:rFonts w:asciiTheme="minorHAnsi" w:eastAsia="等线" w:hAnsiTheme="minorHAnsi" w:cs="Calibri"/>
                 <w:spacing w:val="-2"/>
                 <w:sz w:val="22"/>
                 <w:szCs w:val="22"/>
                 <w:lang w:eastAsia="zh-CN"/>
               </w:rPr>
-              <w:t>{{v.II.3.</w:t>
-            </w:r>
-            <w:r>
-              <w:rPr>
-                <w:rFonts w:asciiTheme="minorHAnsi" w:eastAsia="等线" w:hAnsiTheme="minorHAnsi" w:cs="Calibri" w:hint="eastAsia"/>
-                <w:spacing w:val="-2"/>
-                <w:sz w:val="22"/>
-                <w:szCs w:val="22"/>
-                <w:lang w:eastAsia="zh-CN"/>
-              </w:rPr>
-              <w:t>c</w:t>
-            </w:r>
-            <w:r>
-              <w:rPr>
-                <w:rFonts w:asciiTheme="minorHAnsi" w:eastAsia="等线" w:hAnsiTheme="minorHAnsi" w:cs="Calibri" w:hint="eastAsia"/>
-                <w:spacing w:val="-2"/>
-                <w:sz w:val="22"/>
-                <w:szCs w:val="22"/>
-                <w:lang w:eastAsia="zh-CN"/>
-              </w:rPr>
-              <w:t>.1.6</w:t>
-            </w:r>
-            <w:r>
-              <w:rPr>
-                <w:rFonts w:asciiTheme="minorHAnsi" w:eastAsia="等线" w:hAnsiTheme="minorHAnsi" w:cs="Calibri" w:hint="eastAsia"/>
-                <w:spacing w:val="-2"/>
-                <w:sz w:val="22"/>
-                <w:szCs w:val="22"/>
-                <w:lang w:eastAsia="zh-CN"/>
-              </w:rPr>
-              <w:t>}}</w:t>
+              <w:t>{{v.II.3.c.1.6}}</w:t>
             </w:r>
           </w:p>
         </w:tc>
@@ -25154,7 +23343,7 @@
           <w:noProof/>
         </w:rPr>
         <w:drawing>
-          <wp:inline distT="0" distB="0" distL="0" distR="0" wp14:anchorId="7304CA1E" wp14:editId="7C520154">
+          <wp:inline distT="0" distB="0" distL="0" distR="0" wp14:anchorId="7304CA1E" wp14:editId="5262435B">
             <wp:extent cx="1571625" cy="180975"/>
             <wp:effectExtent l="0" t="0" r="9525" b="9525"/>
             <wp:docPr id="16" name="Picture 16"/>
@@ -36846,12 +35035,37 @@
 </file>
 
 <file path=customXml/item1.xml><?xml version="1.0" encoding="utf-8"?>
-<p:properties xmlns:p="http://schemas.microsoft.com/office/2006/metadata/properties" xmlns:xsi="http://www.w3.org/2001/XMLSchema-instance" xmlns:pc="http://schemas.microsoft.com/office/infopath/2007/PartnerControls">
-  <documentManagement/>
-</p:properties>
+<b:Sources xmlns:b="http://schemas.openxmlformats.org/officeDocument/2006/bibliography" xmlns="http://schemas.openxmlformats.org/officeDocument/2006/bibliography" SelectedStyle="\APASixthEditionOfficeOnline.xsl" StyleName="APA" Version="6"/>
 </file>
 
 <file path=customXml/item2.xml><?xml version="1.0" encoding="utf-8"?>
+<s:customData xmlns="http://www.wps.cn/officeDocument/2013/wpsCustomData" xmlns:s="http://www.wps.cn/officeDocument/2013/wpsCustomData">
+  <customSectProps>
+    <customSectPr/>
+    <customSectPr/>
+    <customSectPr/>
+    <customSectPr/>
+    <customSectPr/>
+    <customSectPr/>
+    <customSectPr/>
+    <customSectPr/>
+    <customSectPr/>
+    <customSectPr/>
+    <customSectPr/>
+    <customSectPr/>
+    <customSectPr/>
+    <customSectPr/>
+    <customSectPr/>
+    <customSectPr/>
+    <customSectPr/>
+    <customSectPr/>
+    <customSectPr/>
+    <customSectPr/>
+  </customSectProps>
+</s:customData>
+</file>
+
+<file path=customXml/item3.xml><?xml version="1.0" encoding="utf-8"?>
 <ct:contentTypeSchema xmlns:ct="http://schemas.microsoft.com/office/2006/metadata/contentType" xmlns:ma="http://schemas.microsoft.com/office/2006/metadata/properties/metaAttributes" ct:_="" ma:_="" ma:contentTypeName="Unknown Document Type" ma:contentTypeID="0x010104" ma:contentTypeVersion="0" ma:contentTypeDescription="" ma:contentTypeScope="" ma:versionID="279c20c3caf3300dae6b438536eb8c56">
   <xsd:schema xmlns:xsd="http://www.w3.org/2001/XMLSchema" xmlns:p="http://schemas.microsoft.com/office/2006/metadata/properties" targetNamespace="http://schemas.microsoft.com/office/2006/metadata/properties" ma:root="true" ma:fieldsID="0d2e1ca116041f9e11471c52c4c9d602">
     <xsd:element name="properties">
@@ -36900,10 +35114,6 @@
 </ct:contentTypeSchema>
 </file>
 
-<file path=customXml/item3.xml><?xml version="1.0" encoding="utf-8"?>
-<b:Sources xmlns:b="http://schemas.openxmlformats.org/officeDocument/2006/bibliography" xmlns="http://schemas.openxmlformats.org/officeDocument/2006/bibliography" SelectedStyle="\APASixthEditionOfficeOnline.xsl" StyleName="APA" Version="6"/>
-</file>
-
 <file path=customXml/item4.xml><?xml version="1.0" encoding="utf-8"?>
 <?mso-contentType ?>
 <FormTemplates xmlns="http://schemas.microsoft.com/sharepoint/v3/contenttype/forms">
@@ -36914,42 +35124,28 @@
 </file>
 
 <file path=customXml/item5.xml><?xml version="1.0" encoding="utf-8"?>
-<s:customData xmlns="http://www.wps.cn/officeDocument/2013/wpsCustomData" xmlns:s="http://www.wps.cn/officeDocument/2013/wpsCustomData">
-  <customSectProps>
-    <customSectPr/>
-    <customSectPr/>
-    <customSectPr/>
-    <customSectPr/>
-    <customSectPr/>
-    <customSectPr/>
-    <customSectPr/>
-    <customSectPr/>
-    <customSectPr/>
-    <customSectPr/>
-    <customSectPr/>
-    <customSectPr/>
-    <customSectPr/>
-    <customSectPr/>
-    <customSectPr/>
-    <customSectPr/>
-    <customSectPr/>
-    <customSectPr/>
-    <customSectPr/>
-    <customSectPr/>
-  </customSectProps>
-</s:customData>
+<p:properties xmlns:p="http://schemas.microsoft.com/office/2006/metadata/properties" xmlns:xsi="http://www.w3.org/2001/XMLSchema-instance" xmlns:pc="http://schemas.microsoft.com/office/infopath/2007/PartnerControls">
+  <documentManagement/>
+</p:properties>
 </file>
 
 <file path=customXml/itemProps1.xml><?xml version="1.0" encoding="utf-8"?>
-<ds:datastoreItem xmlns:ds="http://schemas.openxmlformats.org/officeDocument/2006/customXml" ds:itemID="{878F68AD-C526-4B1F-AD0C-C6DAE4468B69}">
+<ds:datastoreItem xmlns:ds="http://schemas.openxmlformats.org/officeDocument/2006/customXml" ds:itemID="{7D6151A4-B6DB-494B-AB91-28B498875E6B}">
   <ds:schemaRefs>
-    <ds:schemaRef ds:uri="http://schemas.microsoft.com/office/2006/metadata/properties"/>
-    <ds:schemaRef ds:uri="http://schemas.microsoft.com/office/infopath/2007/PartnerControls"/>
+    <ds:schemaRef ds:uri="http://schemas.openxmlformats.org/officeDocument/2006/bibliography"/>
   </ds:schemaRefs>
 </ds:datastoreItem>
 </file>
 
 <file path=customXml/itemProps2.xml><?xml version="1.0" encoding="utf-8"?>
+<ds:datastoreItem xmlns:ds="http://schemas.openxmlformats.org/officeDocument/2006/customXml" ds:itemID="{B1977F7D-205B-4081-913C-38D41E755F92}">
+  <ds:schemaRefs>
+    <ds:schemaRef ds:uri="http://www.wps.cn/officeDocument/2013/wpsCustomData"/>
+  </ds:schemaRefs>
+</ds:datastoreItem>
+</file>
+
+<file path=customXml/itemProps3.xml><?xml version="1.0" encoding="utf-8"?>
 <ds:datastoreItem xmlns:ds="http://schemas.openxmlformats.org/officeDocument/2006/customXml" ds:itemID="{9441B684-D357-44F8-9511-56A8305810A8}">
   <ds:schemaRefs>
     <ds:schemaRef ds:uri="http://schemas.microsoft.com/office/2006/metadata/contentType"/>
@@ -36964,14 +35160,6 @@
 </ds:datastoreItem>
 </file>
 
-<file path=customXml/itemProps3.xml><?xml version="1.0" encoding="utf-8"?>
-<ds:datastoreItem xmlns:ds="http://schemas.openxmlformats.org/officeDocument/2006/customXml" ds:itemID="{7D6151A4-B6DB-494B-AB91-28B498875E6B}">
-  <ds:schemaRefs>
-    <ds:schemaRef ds:uri="http://schemas.openxmlformats.org/officeDocument/2006/bibliography"/>
-  </ds:schemaRefs>
-</ds:datastoreItem>
-</file>
-
 <file path=customXml/itemProps4.xml><?xml version="1.0" encoding="utf-8"?>
 <ds:datastoreItem xmlns:ds="http://schemas.openxmlformats.org/officeDocument/2006/customXml" ds:itemID="{060163FF-80F5-4CF2-BC8D-C23B81A65CC5}">
   <ds:schemaRefs>
@@ -36981,9 +35169,10 @@
 </file>
 
 <file path=customXml/itemProps5.xml><?xml version="1.0" encoding="utf-8"?>
-<ds:datastoreItem xmlns:ds="http://schemas.openxmlformats.org/officeDocument/2006/customXml" ds:itemID="{B1977F7D-205B-4081-913C-38D41E755F92}">
+<ds:datastoreItem xmlns:ds="http://schemas.openxmlformats.org/officeDocument/2006/customXml" ds:itemID="{878F68AD-C526-4B1F-AD0C-C6DAE4468B69}">
   <ds:schemaRefs>
-    <ds:schemaRef ds:uri="http://www.wps.cn/officeDocument/2013/wpsCustomData"/>
+    <ds:schemaRef ds:uri="http://schemas.microsoft.com/office/2006/metadata/properties"/>
+    <ds:schemaRef ds:uri="http://schemas.microsoft.com/office/infopath/2007/PartnerControls"/>
   </ds:schemaRefs>
 </ds:datastoreItem>
 </file>
</xml_diff>